<commit_message>
Use Times New Roman in the two-page editable Word report
</commit_message>
<xml_diff>
--- a/deliverables/AI6101_Report_YourName_YourMatriculationNumber.docx
+++ b/deliverables/AI6101_Report_YourName_YourMatriculationNumber.docx
@@ -10,6 +10,7 @@
       </w:pPr>
       <w:r>
         <w:rPr>
+          <w:rFonts w:ascii="Times New Roman" w:hAnsi="Times New Roman" w:eastAsia="Times New Roman" w:cs="Times New Roman"/>
           <w:b/>
           <w:color w:val="13334C"/>
           <w:sz w:val="29"/>
@@ -27,6 +28,7 @@
       </w:pPr>
       <w:r>
         <w:rPr>
+          <w:rFonts w:ascii="Times New Roman" w:hAnsi="Times New Roman" w:eastAsia="Times New Roman" w:cs="Times New Roman"/>
           <w:color w:val="5A6976"/>
           <w:sz w:val="16"/>
         </w:rPr>
@@ -40,6 +42,7 @@
       </w:pPr>
       <w:r>
         <w:rPr>
+          <w:rFonts w:ascii="Times New Roman" w:hAnsi="Times New Roman" w:eastAsia="Times New Roman" w:cs="Times New Roman"/>
           <w:b/>
           <w:i w:val="0"/>
           <w:color w:val="1A4F75"/>
@@ -54,6 +57,7 @@
       </w:pPr>
       <w:r>
         <w:rPr>
+          <w:rFonts w:ascii="Times New Roman" w:hAnsi="Times New Roman" w:eastAsia="Times New Roman" w:cs="Times New Roman"/>
           <w:b w:val="0"/>
           <w:i w:val="0"/>
           <w:sz w:val="16"/>
@@ -67,6 +71,7 @@
       </w:pPr>
       <w:r>
         <w:rPr>
+          <w:rFonts w:ascii="Times New Roman" w:hAnsi="Times New Roman" w:eastAsia="Times New Roman" w:cs="Times New Roman"/>
           <w:b/>
           <w:i w:val="0"/>
           <w:sz w:val="16"/>
@@ -75,6 +80,7 @@
       </w:r>
       <w:r>
         <w:rPr>
+          <w:rFonts w:ascii="Times New Roman" w:hAnsi="Times New Roman" w:eastAsia="Times New Roman" w:cs="Times New Roman"/>
           <w:b w:val="0"/>
           <w:i w:val="0"/>
           <w:sz w:val="16"/>
@@ -83,6 +89,7 @@
       </w:r>
       <w:r>
         <w:rPr>
+          <w:rFonts w:ascii="Times New Roman" w:hAnsi="Times New Roman" w:eastAsia="Times New Roman" w:cs="Times New Roman"/>
           <w:b w:val="0"/>
           <w:i w:val="0"/>
           <w:sz w:val="16"/>
@@ -92,6 +99,7 @@
       </w:r>
       <w:r>
         <w:rPr>
+          <w:rFonts w:ascii="Times New Roman" w:hAnsi="Times New Roman" w:eastAsia="Times New Roman" w:cs="Times New Roman"/>
           <w:b w:val="0"/>
           <w:i w:val="0"/>
           <w:sz w:val="16"/>
@@ -106,6 +114,9 @@
         <w:jc w:val="center"/>
       </w:pPr>
       <w:r>
+        <w:rPr>
+          <w:rFonts w:ascii="Times New Roman" w:hAnsi="Times New Roman" w:eastAsia="Times New Roman" w:cs="Times New Roman"/>
+        </w:rPr>
         <w:drawing>
           <wp:inline xmlns:a="http://schemas.openxmlformats.org/drawingml/2006/main" xmlns:pic="http://schemas.openxmlformats.org/drawingml/2006/picture">
             <wp:extent cx="6350000" cy="2012723"/>
@@ -146,6 +157,7 @@
       </w:pPr>
       <w:r>
         <w:rPr>
+          <w:rFonts w:ascii="Times New Roman" w:hAnsi="Times New Roman" w:eastAsia="Times New Roman" w:cs="Times New Roman"/>
           <w:b/>
           <w:i w:val="0"/>
           <w:color w:val="41515D"/>
@@ -155,6 +167,7 @@
       </w:r>
       <w:r>
         <w:rPr>
+          <w:rFonts w:ascii="Times New Roman" w:hAnsi="Times New Roman" w:eastAsia="Times New Roman" w:cs="Times New Roman"/>
           <w:b w:val="0"/>
           <w:i w:val="0"/>
           <w:color w:val="41515D"/>
@@ -170,6 +183,7 @@
       </w:pPr>
       <w:r>
         <w:rPr>
+          <w:rFonts w:ascii="Times New Roman" w:hAnsi="Times New Roman" w:eastAsia="Times New Roman" w:cs="Times New Roman"/>
           <w:b/>
           <w:i w:val="0"/>
           <w:color w:val="1A4F75"/>
@@ -185,6 +199,9 @@
         <w:jc w:val="center"/>
       </w:pPr>
       <w:r>
+        <w:rPr>
+          <w:rFonts w:ascii="Times New Roman" w:hAnsi="Times New Roman" w:eastAsia="Times New Roman" w:cs="Times New Roman"/>
+        </w:rPr>
         <w:drawing>
           <wp:inline xmlns:a="http://schemas.openxmlformats.org/drawingml/2006/main" xmlns:pic="http://schemas.openxmlformats.org/drawingml/2006/picture">
             <wp:extent cx="5778500" cy="2406325"/>
@@ -225,6 +242,7 @@
       </w:pPr>
       <w:r>
         <w:rPr>
+          <w:rFonts w:ascii="Times New Roman" w:hAnsi="Times New Roman" w:eastAsia="Times New Roman" w:cs="Times New Roman"/>
           <w:b/>
           <w:i w:val="0"/>
           <w:color w:val="41515D"/>
@@ -234,6 +252,7 @@
       </w:r>
       <w:r>
         <w:rPr>
+          <w:rFonts w:ascii="Times New Roman" w:hAnsi="Times New Roman" w:eastAsia="Times New Roman" w:cs="Times New Roman"/>
           <w:b w:val="0"/>
           <w:i w:val="0"/>
           <w:color w:val="41515D"/>
@@ -249,6 +268,9 @@
         <w:jc w:val="center"/>
       </w:pPr>
       <w:r>
+        <w:rPr>
+          <w:rFonts w:ascii="Times New Roman" w:hAnsi="Times New Roman" w:eastAsia="Times New Roman" w:cs="Times New Roman"/>
+        </w:rPr>
         <w:drawing>
           <wp:inline xmlns:a="http://schemas.openxmlformats.org/drawingml/2006/main" xmlns:pic="http://schemas.openxmlformats.org/drawingml/2006/picture">
             <wp:extent cx="6350000" cy="1462528"/>
@@ -289,6 +311,7 @@
       </w:pPr>
       <w:r>
         <w:rPr>
+          <w:rFonts w:ascii="Times New Roman" w:hAnsi="Times New Roman" w:eastAsia="Times New Roman" w:cs="Times New Roman"/>
           <w:b/>
           <w:i w:val="0"/>
           <w:color w:val="41515D"/>
@@ -298,6 +321,7 @@
       </w:r>
       <w:r>
         <w:rPr>
+          <w:rFonts w:ascii="Times New Roman" w:hAnsi="Times New Roman" w:eastAsia="Times New Roman" w:cs="Times New Roman"/>
           <w:b w:val="0"/>
           <w:i w:val="0"/>
           <w:color w:val="41515D"/>
@@ -307,6 +331,7 @@
       </w:r>
       <w:r>
         <w:rPr>
+          <w:rFonts w:ascii="Times New Roman" w:hAnsi="Times New Roman" w:eastAsia="Times New Roman" w:cs="Times New Roman"/>
           <w:b w:val="0"/>
           <w:i w:val="0"/>
           <w:color w:val="41515D"/>
@@ -317,6 +342,7 @@
       </w:r>
       <w:r>
         <w:rPr>
+          <w:rFonts w:ascii="Times New Roman" w:hAnsi="Times New Roman" w:eastAsia="Times New Roman" w:cs="Times New Roman"/>
           <w:b w:val="0"/>
           <w:i w:val="0"/>
           <w:color w:val="41515D"/>
@@ -333,6 +359,7 @@
       </w:pPr>
       <w:r>
         <w:rPr>
+          <w:rFonts w:ascii="Times New Roman" w:hAnsi="Times New Roman" w:eastAsia="Times New Roman" w:cs="Times New Roman"/>
           <w:b/>
           <w:color w:val="13334C"/>
           <w:sz w:val="29"/>
@@ -350,6 +377,7 @@
       </w:pPr>
       <w:r>
         <w:rPr>
+          <w:rFonts w:ascii="Times New Roman" w:hAnsi="Times New Roman" w:eastAsia="Times New Roman" w:cs="Times New Roman"/>
           <w:color w:val="5A6976"/>
           <w:sz w:val="16"/>
         </w:rPr>
@@ -363,6 +391,7 @@
       </w:pPr>
       <w:r>
         <w:rPr>
+          <w:rFonts w:ascii="Times New Roman" w:hAnsi="Times New Roman" w:eastAsia="Times New Roman" w:cs="Times New Roman"/>
           <w:b/>
           <w:i w:val="0"/>
           <w:color w:val="1A4F75"/>
@@ -377,6 +406,7 @@
       </w:pPr>
       <w:r>
         <w:rPr>
+          <w:rFonts w:ascii="Times New Roman" w:hAnsi="Times New Roman" w:eastAsia="Times New Roman" w:cs="Times New Roman"/>
           <w:b w:val="0"/>
           <w:i w:val="0"/>
           <w:sz w:val="16"/>
@@ -413,6 +443,7 @@
             </w:pPr>
             <w:r>
               <w:rPr>
+                <w:rFonts w:ascii="Times New Roman" w:hAnsi="Times New Roman" w:eastAsia="Times New Roman" w:cs="Times New Roman"/>
                 <w:b/>
                 <w:i w:val="0"/>
                 <w:sz w:val="14"/>
@@ -433,6 +464,7 @@
             </w:pPr>
             <w:r>
               <w:rPr>
+                <w:rFonts w:ascii="Times New Roman" w:hAnsi="Times New Roman" w:eastAsia="Times New Roman" w:cs="Times New Roman"/>
                 <w:b/>
                 <w:i w:val="0"/>
                 <w:sz w:val="14"/>
@@ -453,6 +485,7 @@
             </w:pPr>
             <w:r>
               <w:rPr>
+                <w:rFonts w:ascii="Times New Roman" w:hAnsi="Times New Roman" w:eastAsia="Times New Roman" w:cs="Times New Roman"/>
                 <w:b/>
                 <w:i w:val="0"/>
                 <w:sz w:val="14"/>
@@ -473,6 +506,7 @@
             </w:pPr>
             <w:r>
               <w:rPr>
+                <w:rFonts w:ascii="Times New Roman" w:hAnsi="Times New Roman" w:eastAsia="Times New Roman" w:cs="Times New Roman"/>
                 <w:b/>
                 <w:i w:val="0"/>
                 <w:sz w:val="14"/>
@@ -497,6 +531,7 @@
             </w:pPr>
             <w:r>
               <w:rPr>
+                <w:rFonts w:ascii="Times New Roman" w:hAnsi="Times New Roman" w:eastAsia="Times New Roman" w:cs="Times New Roman"/>
                 <w:b w:val="0"/>
                 <w:i w:val="0"/>
                 <w:sz w:val="14"/>
@@ -516,6 +551,7 @@
             </w:pPr>
             <w:r>
               <w:rPr>
+                <w:rFonts w:ascii="Times New Roman" w:hAnsi="Times New Roman" w:eastAsia="Times New Roman" w:cs="Times New Roman"/>
                 <w:b w:val="0"/>
                 <w:i w:val="0"/>
                 <w:sz w:val="14"/>
@@ -535,6 +571,7 @@
             </w:pPr>
             <w:r>
               <w:rPr>
+                <w:rFonts w:ascii="Times New Roman" w:hAnsi="Times New Roman" w:eastAsia="Times New Roman" w:cs="Times New Roman"/>
                 <w:b w:val="0"/>
                 <w:i w:val="0"/>
                 <w:sz w:val="14"/>
@@ -554,6 +591,7 @@
             </w:pPr>
             <w:r>
               <w:rPr>
+                <w:rFonts w:ascii="Times New Roman" w:hAnsi="Times New Roman" w:eastAsia="Times New Roman" w:cs="Times New Roman"/>
                 <w:b w:val="0"/>
                 <w:i w:val="0"/>
                 <w:sz w:val="14"/>
@@ -578,6 +616,7 @@
             </w:pPr>
             <w:r>
               <w:rPr>
+                <w:rFonts w:ascii="Times New Roman" w:hAnsi="Times New Roman" w:eastAsia="Times New Roman" w:cs="Times New Roman"/>
                 <w:b w:val="0"/>
                 <w:i w:val="0"/>
                 <w:sz w:val="14"/>
@@ -597,6 +636,7 @@
             </w:pPr>
             <w:r>
               <w:rPr>
+                <w:rFonts w:ascii="Times New Roman" w:hAnsi="Times New Roman" w:eastAsia="Times New Roman" w:cs="Times New Roman"/>
                 <w:b w:val="0"/>
                 <w:i w:val="0"/>
                 <w:sz w:val="14"/>
@@ -616,6 +656,7 @@
             </w:pPr>
             <w:r>
               <w:rPr>
+                <w:rFonts w:ascii="Times New Roman" w:hAnsi="Times New Roman" w:eastAsia="Times New Roman" w:cs="Times New Roman"/>
                 <w:b w:val="0"/>
                 <w:i w:val="0"/>
                 <w:sz w:val="14"/>
@@ -635,6 +676,7 @@
             </w:pPr>
             <w:r>
               <w:rPr>
+                <w:rFonts w:ascii="Times New Roman" w:hAnsi="Times New Roman" w:eastAsia="Times New Roman" w:cs="Times New Roman"/>
                 <w:b w:val="0"/>
                 <w:i w:val="0"/>
                 <w:sz w:val="14"/>
@@ -659,6 +701,7 @@
             </w:pPr>
             <w:r>
               <w:rPr>
+                <w:rFonts w:ascii="Times New Roman" w:hAnsi="Times New Roman" w:eastAsia="Times New Roman" w:cs="Times New Roman"/>
                 <w:b w:val="0"/>
                 <w:i w:val="0"/>
                 <w:sz w:val="14"/>
@@ -678,6 +721,7 @@
             </w:pPr>
             <w:r>
               <w:rPr>
+                <w:rFonts w:ascii="Times New Roman" w:hAnsi="Times New Roman" w:eastAsia="Times New Roman" w:cs="Times New Roman"/>
                 <w:b w:val="0"/>
                 <w:i w:val="0"/>
                 <w:sz w:val="14"/>
@@ -697,6 +741,7 @@
             </w:pPr>
             <w:r>
               <w:rPr>
+                <w:rFonts w:ascii="Times New Roman" w:hAnsi="Times New Roman" w:eastAsia="Times New Roman" w:cs="Times New Roman"/>
                 <w:b w:val="0"/>
                 <w:i w:val="0"/>
                 <w:sz w:val="14"/>
@@ -716,6 +761,7 @@
             </w:pPr>
             <w:r>
               <w:rPr>
+                <w:rFonts w:ascii="Times New Roman" w:hAnsi="Times New Roman" w:eastAsia="Times New Roman" w:cs="Times New Roman"/>
                 <w:b w:val="0"/>
                 <w:i w:val="0"/>
                 <w:sz w:val="14"/>
@@ -732,6 +778,7 @@
       </w:pPr>
       <w:r>
         <w:rPr>
+          <w:rFonts w:ascii="Times New Roman" w:hAnsi="Times New Roman" w:eastAsia="Times New Roman" w:cs="Times New Roman"/>
           <w:sz w:val="2"/>
         </w:rPr>
       </w:r>
@@ -742,6 +789,7 @@
       </w:pPr>
       <w:r>
         <w:rPr>
+          <w:rFonts w:ascii="Times New Roman" w:hAnsi="Times New Roman" w:eastAsia="Times New Roman" w:cs="Times New Roman"/>
           <w:b w:val="0"/>
           <w:i w:val="0"/>
           <w:color w:val="41515D"/>
@@ -757,6 +805,7 @@
       </w:pPr>
       <w:r>
         <w:rPr>
+          <w:rFonts w:ascii="Times New Roman" w:hAnsi="Times New Roman" w:eastAsia="Times New Roman" w:cs="Times New Roman"/>
           <w:b/>
           <w:i w:val="0"/>
           <w:color w:val="1A4F75"/>
@@ -771,6 +820,7 @@
       </w:pPr>
       <w:r>
         <w:rPr>
+          <w:rFonts w:ascii="Times New Roman" w:hAnsi="Times New Roman" w:eastAsia="Times New Roman" w:cs="Times New Roman"/>
           <w:b/>
           <w:i w:val="0"/>
           <w:sz w:val="16"/>
@@ -779,6 +829,7 @@
       </w:r>
       <w:r>
         <w:rPr>
+          <w:rFonts w:ascii="Times New Roman" w:hAnsi="Times New Roman" w:eastAsia="Times New Roman" w:cs="Times New Roman"/>
           <w:b w:val="0"/>
           <w:i w:val="0"/>
           <w:sz w:val="16"/>
@@ -792,6 +843,7 @@
       </w:pPr>
       <w:r>
         <w:rPr>
+          <w:rFonts w:ascii="Times New Roman" w:hAnsi="Times New Roman" w:eastAsia="Times New Roman" w:cs="Times New Roman"/>
           <w:b w:val="0"/>
           <w:i w:val="0"/>
           <w:sz w:val="16"/>
@@ -800,6 +852,7 @@
       </w:r>
       <w:r>
         <w:rPr>
+          <w:rFonts w:ascii="Times New Roman" w:hAnsi="Times New Roman" w:eastAsia="Times New Roman" w:cs="Times New Roman"/>
           <w:b w:val="0"/>
           <w:i w:val="0"/>
           <w:sz w:val="16"/>
@@ -809,6 +862,7 @@
       </w:r>
       <w:r>
         <w:rPr>
+          <w:rFonts w:ascii="Times New Roman" w:hAnsi="Times New Roman" w:eastAsia="Times New Roman" w:cs="Times New Roman"/>
           <w:b w:val="0"/>
           <w:i w:val="0"/>
           <w:sz w:val="16"/>
@@ -818,6 +872,7 @@
       </w:r>
       <w:r>
         <w:rPr>
+          <w:rFonts w:ascii="Times New Roman" w:hAnsi="Times New Roman" w:eastAsia="Times New Roman" w:cs="Times New Roman"/>
           <w:b w:val="0"/>
           <w:i w:val="0"/>
           <w:sz w:val="16"/>
@@ -826,6 +881,7 @@
       </w:r>
       <w:r>
         <w:rPr>
+          <w:rFonts w:ascii="Times New Roman" w:hAnsi="Times New Roman" w:eastAsia="Times New Roman" w:cs="Times New Roman"/>
           <w:b w:val="0"/>
           <w:i w:val="0"/>
           <w:sz w:val="16"/>
@@ -835,6 +891,7 @@
       </w:r>
       <w:r>
         <w:rPr>
+          <w:rFonts w:ascii="Times New Roman" w:hAnsi="Times New Roman" w:eastAsia="Times New Roman" w:cs="Times New Roman"/>
           <w:b w:val="0"/>
           <w:i w:val="0"/>
           <w:sz w:val="16"/>
@@ -843,6 +900,7 @@
       </w:r>
       <w:r>
         <w:rPr>
+          <w:rFonts w:ascii="Times New Roman" w:hAnsi="Times New Roman" w:eastAsia="Times New Roman" w:cs="Times New Roman"/>
           <w:b w:val="0"/>
           <w:i w:val="0"/>
           <w:sz w:val="16"/>
@@ -852,6 +910,7 @@
       </w:r>
       <w:r>
         <w:rPr>
+          <w:rFonts w:ascii="Times New Roman" w:hAnsi="Times New Roman" w:eastAsia="Times New Roman" w:cs="Times New Roman"/>
           <w:b w:val="0"/>
           <w:i w:val="0"/>
           <w:sz w:val="16"/>
@@ -860,6 +919,7 @@
       </w:r>
       <w:r>
         <w:rPr>
+          <w:rFonts w:ascii="Times New Roman" w:hAnsi="Times New Roman" w:eastAsia="Times New Roman" w:cs="Times New Roman"/>
           <w:b w:val="0"/>
           <w:i w:val="0"/>
           <w:sz w:val="16"/>
@@ -869,6 +929,7 @@
       </w:r>
       <w:r>
         <w:rPr>
+          <w:rFonts w:ascii="Times New Roman" w:hAnsi="Times New Roman" w:eastAsia="Times New Roman" w:cs="Times New Roman"/>
           <w:b w:val="0"/>
           <w:i w:val="0"/>
           <w:sz w:val="16"/>
@@ -877,6 +938,7 @@
       </w:r>
       <w:r>
         <w:rPr>
+          <w:rFonts w:ascii="Times New Roman" w:hAnsi="Times New Roman" w:eastAsia="Times New Roman" w:cs="Times New Roman"/>
           <w:b w:val="0"/>
           <w:i w:val="0"/>
           <w:sz w:val="16"/>
@@ -886,6 +948,7 @@
       </w:r>
       <w:r>
         <w:rPr>
+          <w:rFonts w:ascii="Times New Roman" w:hAnsi="Times New Roman" w:eastAsia="Times New Roman" w:cs="Times New Roman"/>
           <w:b w:val="0"/>
           <w:i w:val="0"/>
           <w:sz w:val="16"/>
@@ -922,6 +985,7 @@
             </w:pPr>
             <w:r>
               <w:rPr>
+                <w:rFonts w:ascii="Times New Roman" w:hAnsi="Times New Roman" w:eastAsia="Times New Roman" w:cs="Times New Roman"/>
                 <w:b/>
                 <w:i w:val="0"/>
                 <w:sz w:val="14"/>
@@ -942,6 +1006,7 @@
             </w:pPr>
             <w:r>
               <w:rPr>
+                <w:rFonts w:ascii="Times New Roman" w:hAnsi="Times New Roman" w:eastAsia="Times New Roman" w:cs="Times New Roman"/>
                 <w:b/>
                 <w:i w:val="0"/>
                 <w:sz w:val="14"/>
@@ -962,6 +1027,7 @@
             </w:pPr>
             <w:r>
               <w:rPr>
+                <w:rFonts w:ascii="Times New Roman" w:hAnsi="Times New Roman" w:eastAsia="Times New Roman" w:cs="Times New Roman"/>
                 <w:b/>
                 <w:i w:val="0"/>
                 <w:sz w:val="14"/>
@@ -982,6 +1048,7 @@
             </w:pPr>
             <w:r>
               <w:rPr>
+                <w:rFonts w:ascii="Times New Roman" w:hAnsi="Times New Roman" w:eastAsia="Times New Roman" w:cs="Times New Roman"/>
                 <w:b/>
                 <w:i w:val="0"/>
                 <w:sz w:val="14"/>
@@ -1006,6 +1073,7 @@
             </w:pPr>
             <w:r>
               <w:rPr>
+                <w:rFonts w:ascii="Times New Roman" w:hAnsi="Times New Roman" w:eastAsia="Times New Roman" w:cs="Times New Roman"/>
                 <w:b w:val="0"/>
                 <w:i w:val="0"/>
                 <w:sz w:val="14"/>
@@ -1025,6 +1093,7 @@
             </w:pPr>
             <w:r>
               <w:rPr>
+                <w:rFonts w:ascii="Times New Roman" w:hAnsi="Times New Roman" w:eastAsia="Times New Roman" w:cs="Times New Roman"/>
                 <w:b w:val="0"/>
                 <w:i w:val="0"/>
                 <w:sz w:val="14"/>
@@ -1044,6 +1113,7 @@
             </w:pPr>
             <w:r>
               <w:rPr>
+                <w:rFonts w:ascii="Times New Roman" w:hAnsi="Times New Roman" w:eastAsia="Times New Roman" w:cs="Times New Roman"/>
                 <w:b w:val="0"/>
                 <w:i w:val="0"/>
                 <w:sz w:val="14"/>
@@ -1063,6 +1133,7 @@
             </w:pPr>
             <w:r>
               <w:rPr>
+                <w:rFonts w:ascii="Times New Roman" w:hAnsi="Times New Roman" w:eastAsia="Times New Roman" w:cs="Times New Roman"/>
                 <w:b w:val="0"/>
                 <w:i w:val="0"/>
                 <w:sz w:val="14"/>
@@ -1087,6 +1158,7 @@
             </w:pPr>
             <w:r>
               <w:rPr>
+                <w:rFonts w:ascii="Times New Roman" w:hAnsi="Times New Roman" w:eastAsia="Times New Roman" w:cs="Times New Roman"/>
                 <w:b w:val="0"/>
                 <w:i w:val="0"/>
                 <w:sz w:val="14"/>
@@ -1106,6 +1178,7 @@
             </w:pPr>
             <w:r>
               <w:rPr>
+                <w:rFonts w:ascii="Times New Roman" w:hAnsi="Times New Roman" w:eastAsia="Times New Roman" w:cs="Times New Roman"/>
                 <w:b w:val="0"/>
                 <w:i w:val="0"/>
                 <w:sz w:val="14"/>
@@ -1125,6 +1198,7 @@
             </w:pPr>
             <w:r>
               <w:rPr>
+                <w:rFonts w:ascii="Times New Roman" w:hAnsi="Times New Roman" w:eastAsia="Times New Roman" w:cs="Times New Roman"/>
                 <w:b w:val="0"/>
                 <w:i w:val="0"/>
                 <w:sz w:val="14"/>
@@ -1144,6 +1218,7 @@
             </w:pPr>
             <w:r>
               <w:rPr>
+                <w:rFonts w:ascii="Times New Roman" w:hAnsi="Times New Roman" w:eastAsia="Times New Roman" w:cs="Times New Roman"/>
                 <w:b w:val="0"/>
                 <w:i w:val="0"/>
                 <w:sz w:val="14"/>
@@ -1168,6 +1243,7 @@
             </w:pPr>
             <w:r>
               <w:rPr>
+                <w:rFonts w:ascii="Times New Roman" w:hAnsi="Times New Roman" w:eastAsia="Times New Roman" w:cs="Times New Roman"/>
                 <w:b w:val="0"/>
                 <w:i w:val="0"/>
                 <w:sz w:val="14"/>
@@ -1187,6 +1263,7 @@
             </w:pPr>
             <w:r>
               <w:rPr>
+                <w:rFonts w:ascii="Times New Roman" w:hAnsi="Times New Roman" w:eastAsia="Times New Roman" w:cs="Times New Roman"/>
                 <w:b w:val="0"/>
                 <w:i w:val="0"/>
                 <w:sz w:val="14"/>
@@ -1206,6 +1283,7 @@
             </w:pPr>
             <w:r>
               <w:rPr>
+                <w:rFonts w:ascii="Times New Roman" w:hAnsi="Times New Roman" w:eastAsia="Times New Roman" w:cs="Times New Roman"/>
                 <w:b w:val="0"/>
                 <w:i w:val="0"/>
                 <w:sz w:val="14"/>
@@ -1225,6 +1303,7 @@
             </w:pPr>
             <w:r>
               <w:rPr>
+                <w:rFonts w:ascii="Times New Roman" w:hAnsi="Times New Roman" w:eastAsia="Times New Roman" w:cs="Times New Roman"/>
                 <w:b w:val="0"/>
                 <w:i w:val="0"/>
                 <w:sz w:val="14"/>
@@ -1249,6 +1328,7 @@
             </w:pPr>
             <w:r>
               <w:rPr>
+                <w:rFonts w:ascii="Times New Roman" w:hAnsi="Times New Roman" w:eastAsia="Times New Roman" w:cs="Times New Roman"/>
                 <w:b w:val="0"/>
                 <w:i w:val="0"/>
                 <w:sz w:val="14"/>
@@ -1268,6 +1348,7 @@
             </w:pPr>
             <w:r>
               <w:rPr>
+                <w:rFonts w:ascii="Times New Roman" w:hAnsi="Times New Roman" w:eastAsia="Times New Roman" w:cs="Times New Roman"/>
                 <w:b w:val="0"/>
                 <w:i w:val="0"/>
                 <w:sz w:val="14"/>
@@ -1287,6 +1368,7 @@
             </w:pPr>
             <w:r>
               <w:rPr>
+                <w:rFonts w:ascii="Times New Roman" w:hAnsi="Times New Roman" w:eastAsia="Times New Roman" w:cs="Times New Roman"/>
                 <w:b w:val="0"/>
                 <w:i w:val="0"/>
                 <w:sz w:val="14"/>
@@ -1306,6 +1388,7 @@
             </w:pPr>
             <w:r>
               <w:rPr>
+                <w:rFonts w:ascii="Times New Roman" w:hAnsi="Times New Roman" w:eastAsia="Times New Roman" w:cs="Times New Roman"/>
                 <w:b w:val="0"/>
                 <w:i w:val="0"/>
                 <w:sz w:val="14"/>
@@ -1322,6 +1405,7 @@
       </w:pPr>
       <w:r>
         <w:rPr>
+          <w:rFonts w:ascii="Times New Roman" w:hAnsi="Times New Roman" w:eastAsia="Times New Roman" w:cs="Times New Roman"/>
           <w:sz w:val="2"/>
         </w:rPr>
       </w:r>
@@ -1332,6 +1416,7 @@
       </w:pPr>
       <w:r>
         <w:rPr>
+          <w:rFonts w:ascii="Times New Roman" w:hAnsi="Times New Roman" w:eastAsia="Times New Roman" w:cs="Times New Roman"/>
           <w:b w:val="0"/>
           <w:i w:val="0"/>
           <w:color w:val="41515D"/>
@@ -1347,6 +1432,9 @@
         <w:jc w:val="center"/>
       </w:pPr>
       <w:r>
+        <w:rPr>
+          <w:rFonts w:ascii="Times New Roman" w:hAnsi="Times New Roman" w:eastAsia="Times New Roman" w:cs="Times New Roman"/>
+        </w:rPr>
         <w:drawing>
           <wp:inline xmlns:a="http://schemas.openxmlformats.org/drawingml/2006/main" xmlns:pic="http://schemas.openxmlformats.org/drawingml/2006/picture">
             <wp:extent cx="6350000" cy="1863424"/>
@@ -1387,6 +1475,7 @@
       </w:pPr>
       <w:r>
         <w:rPr>
+          <w:rFonts w:ascii="Times New Roman" w:hAnsi="Times New Roman" w:eastAsia="Times New Roman" w:cs="Times New Roman"/>
           <w:b/>
           <w:i w:val="0"/>
           <w:color w:val="41515D"/>
@@ -1396,6 +1485,7 @@
       </w:r>
       <w:r>
         <w:rPr>
+          <w:rFonts w:ascii="Times New Roman" w:hAnsi="Times New Roman" w:eastAsia="Times New Roman" w:cs="Times New Roman"/>
           <w:b w:val="0"/>
           <w:i w:val="0"/>
           <w:color w:val="41515D"/>
@@ -1410,6 +1500,7 @@
       </w:pPr>
       <w:r>
         <w:rPr>
+          <w:rFonts w:ascii="Times New Roman" w:hAnsi="Times New Roman" w:eastAsia="Times New Roman" w:cs="Times New Roman"/>
           <w:b/>
           <w:i w:val="0"/>
           <w:color w:val="41515D"/>
@@ -1419,6 +1510,7 @@
       </w:r>
       <w:r>
         <w:rPr>
+          <w:rFonts w:ascii="Times New Roman" w:hAnsi="Times New Roman" w:eastAsia="Times New Roman" w:cs="Times New Roman"/>
           <w:b w:val="0"/>
           <w:i w:val="0"/>
           <w:color w:val="41515D"/>
@@ -1428,6 +1520,7 @@
       </w:r>
       <w:r>
         <w:rPr>
+          <w:rFonts w:ascii="Times New Roman" w:hAnsi="Times New Roman" w:eastAsia="Times New Roman" w:cs="Times New Roman"/>
           <w:b/>
           <w:i w:val="0"/>
           <w:color w:val="41515D"/>
@@ -1437,6 +1530,7 @@
       </w:r>
       <w:r>
         <w:rPr>
+          <w:rFonts w:ascii="Times New Roman" w:hAnsi="Times New Roman" w:eastAsia="Times New Roman" w:cs="Times New Roman"/>
           <w:b w:val="0"/>
           <w:i w:val="0"/>
           <w:color w:val="41515D"/>
@@ -1447,6 +1541,7 @@
     </w:p>
     <w:sectPr>
       <w:footerReference w:type="default" r:id="rId13"/>
+      <w:headerReference w:type="default" r:id="rId14"/>
       <w:pgSz w:w="11906" w:h="16838"/>
       <w:pgMar w:top="640" w:right="760" w:bottom="680" w:left="760" w:header="720" w:footer="280" w:gutter="0"/>
       <w:cols w:space="720"/>
@@ -1466,12 +1561,14 @@
     </w:pPr>
     <w:r>
       <w:rPr>
+        <w:rFonts w:ascii="Times New Roman" w:hAnsi="Times New Roman" w:eastAsia="Times New Roman" w:cs="Times New Roman"/>
         <w:sz w:val="14"/>
       </w:rPr>
       <w:t xml:space="preserve">AI6101 · </w:t>
     </w:r>
     <w:r>
       <w:rPr>
+        <w:rFonts w:ascii="Times New Roman" w:hAnsi="Times New Roman" w:eastAsia="Times New Roman" w:cs="Times New Roman"/>
         <w:sz w:val="14"/>
       </w:rPr>
       <w:fldChar w:fldCharType="begin"/>
@@ -1480,12 +1577,14 @@
     </w:r>
     <w:r>
       <w:rPr>
+        <w:rFonts w:ascii="Times New Roman" w:hAnsi="Times New Roman" w:eastAsia="Times New Roman" w:cs="Times New Roman"/>
         <w:sz w:val="14"/>
       </w:rPr>
       <w:t xml:space="preserve"> / </w:t>
     </w:r>
     <w:r>
       <w:rPr>
+        <w:rFonts w:ascii="Times New Roman" w:hAnsi="Times New Roman" w:eastAsia="Times New Roman" w:cs="Times New Roman"/>
         <w:sz w:val="14"/>
       </w:rPr>
       <w:fldChar w:fldCharType="begin"/>
@@ -1494,6 +1593,16 @@
     </w:r>
   </w:p>
 </w:ftr>
+</file>
+
+<file path=word/header1.xml><?xml version="1.0" encoding="utf-8"?>
+<w:hdr xmlns:m="http://schemas.openxmlformats.org/officeDocument/2006/math" xmlns:mc="http://schemas.openxmlformats.org/markup-compatibility/2006" xmlns:mo="http://schemas.microsoft.com/office/mac/office/2008/main" xmlns:mv="urn:schemas-microsoft-com:mac:vml" xmlns:o="urn:schemas-microsoft-com:office:office" xmlns:r="http://schemas.openxmlformats.org/officeDocument/2006/relationships" xmlns:v="urn:schemas-microsoft-com:vml" xmlns:w10="urn:schemas-microsoft-com:office:word" xmlns:w14="http://schemas.microsoft.com/office/word/2010/wordml" xmlns:w="http://schemas.openxmlformats.org/wordprocessingml/2006/main" xmlns:wne="http://schemas.microsoft.com/office/word/2006/wordml" xmlns:wp14="http://schemas.microsoft.com/office/word/2010/wordprocessingDrawing" xmlns:wp="http://schemas.openxmlformats.org/drawingml/2006/wordprocessingDrawing" xmlns:wpc="http://schemas.microsoft.com/office/word/2010/wordprocessingCanvas" xmlns:wpg="http://schemas.microsoft.com/office/word/2010/wordprocessingGroup" xmlns:wpi="http://schemas.microsoft.com/office/word/2010/wordprocessingInk" xmlns:wps="http://schemas.microsoft.com/office/word/2010/wordprocessingShape" mc:Ignorable="w14 wp14">
+  <w:p>
+    <w:pPr>
+      <w:pStyle w:val="Header"/>
+    </w:pPr>
+  </w:p>
+</w:hdr>
 </file>
 
 <file path=word/numbering.xml><?xml version="1.0" encoding="utf-8"?>
@@ -1704,7 +1813,7 @@
   <w:docDefaults>
     <w:rPrDefault>
       <w:rPr>
-        <w:rFonts w:asciiTheme="minorHAnsi" w:eastAsiaTheme="minorEastAsia" w:hAnsiTheme="minorHAnsi" w:cstheme="minorBidi"/>
+        <w:rFonts w:ascii="Times New Roman" w:hAnsi="Times New Roman" w:eastAsia="Times New Roman" w:cs="Times New Roman"/>
         <w:sz w:val="22"/>
         <w:szCs w:val="22"/>
         <w:lang w:val="en-US" w:eastAsia="en-US" w:bidi="ar-SA"/>
@@ -1864,7 +1973,7 @@
       <w:spacing w:line="222" w:lineRule="exact" w:after="100"/>
     </w:pPr>
     <w:rPr>
-      <w:rFonts w:ascii="DejaVu Sans" w:hAnsi="DejaVu Sans"/>
+      <w:rFonts w:ascii="Times New Roman" w:hAnsi="Times New Roman" w:eastAsia="Times New Roman" w:cs="Times New Roman"/>
       <w:color w:val="233341"/>
       <w:sz w:val="16"/>
     </w:rPr>
@@ -1883,6 +1992,9 @@
       </w:tabs>
       <w:spacing w:after="0" w:line="240" w:lineRule="auto"/>
     </w:pPr>
+    <w:rPr>
+      <w:rFonts w:ascii="Times New Roman" w:hAnsi="Times New Roman" w:eastAsia="Times New Roman" w:cs="Times New Roman"/>
+    </w:rPr>
   </w:style>
   <w:style w:type="character" w:customStyle="1" w:styleId="HeaderChar">
     <w:name w:val="Header Char"/>
@@ -1890,6 +2002,9 @@
     <w:link w:val="Header"/>
     <w:uiPriority w:val="99"/>
     <w:rsid w:val="00E618BF"/>
+    <w:rPr>
+      <w:rFonts w:ascii="Times New Roman" w:hAnsi="Times New Roman" w:eastAsia="Times New Roman" w:cs="Times New Roman"/>
+    </w:rPr>
   </w:style>
   <w:style w:type="paragraph" w:styleId="Footer">
     <w:name w:val="footer"/>
@@ -1905,6 +2020,9 @@
       </w:tabs>
       <w:spacing w:after="0" w:line="240" w:lineRule="auto"/>
     </w:pPr>
+    <w:rPr>
+      <w:rFonts w:ascii="Times New Roman" w:hAnsi="Times New Roman" w:eastAsia="Times New Roman" w:cs="Times New Roman"/>
+    </w:rPr>
   </w:style>
   <w:style w:type="character" w:customStyle="1" w:styleId="FooterChar">
     <w:name w:val="Footer Char"/>
@@ -1912,6 +2030,9 @@
     <w:link w:val="Footer"/>
     <w:uiPriority w:val="99"/>
     <w:rsid w:val="00E618BF"/>
+    <w:rPr>
+      <w:rFonts w:ascii="Times New Roman" w:hAnsi="Times New Roman" w:eastAsia="Times New Roman" w:cs="Times New Roman"/>
+    </w:rPr>
   </w:style>
   <w:style w:type="paragraph" w:styleId="Heading1">
     <w:name w:val="heading 1"/>
@@ -1928,7 +2049,7 @@
       <w:outlineLvl w:val="0"/>
     </w:pPr>
     <w:rPr>
-      <w:rFonts w:asciiTheme="majorHAnsi" w:eastAsiaTheme="majorEastAsia" w:hAnsiTheme="majorHAnsi" w:cstheme="majorBidi"/>
+      <w:rFonts w:ascii="Times New Roman" w:hAnsi="Times New Roman" w:eastAsia="Times New Roman" w:cs="Times New Roman"/>
       <w:b/>
       <w:bCs/>
       <w:color w:val="365F91" w:themeColor="accent1" w:themeShade="BF"/>
@@ -1952,7 +2073,7 @@
       <w:outlineLvl w:val="1"/>
     </w:pPr>
     <w:rPr>
-      <w:rFonts w:asciiTheme="majorHAnsi" w:eastAsiaTheme="majorEastAsia" w:hAnsiTheme="majorHAnsi" w:cstheme="majorBidi"/>
+      <w:rFonts w:ascii="Times New Roman" w:hAnsi="Times New Roman" w:eastAsia="Times New Roman" w:cs="Times New Roman"/>
       <w:b/>
       <w:bCs/>
       <w:color w:val="4F81BD" w:themeColor="accent1"/>
@@ -1976,7 +2097,7 @@
       <w:outlineLvl w:val="2"/>
     </w:pPr>
     <w:rPr>
-      <w:rFonts w:asciiTheme="majorHAnsi" w:eastAsiaTheme="majorEastAsia" w:hAnsiTheme="majorHAnsi" w:cstheme="majorBidi"/>
+      <w:rFonts w:ascii="Times New Roman" w:hAnsi="Times New Roman" w:eastAsia="Times New Roman" w:cs="Times New Roman"/>
       <w:b/>
       <w:bCs/>
       <w:color w:val="4F81BD" w:themeColor="accent1"/>
@@ -1999,7 +2120,7 @@
       <w:outlineLvl w:val="3"/>
     </w:pPr>
     <w:rPr>
-      <w:rFonts w:asciiTheme="majorHAnsi" w:eastAsiaTheme="majorEastAsia" w:hAnsiTheme="majorHAnsi" w:cstheme="majorBidi"/>
+      <w:rFonts w:ascii="Times New Roman" w:hAnsi="Times New Roman" w:eastAsia="Times New Roman" w:cs="Times New Roman"/>
       <w:b/>
       <w:bCs/>
       <w:i/>
@@ -2024,7 +2145,7 @@
       <w:outlineLvl w:val="4"/>
     </w:pPr>
     <w:rPr>
-      <w:rFonts w:asciiTheme="majorHAnsi" w:eastAsiaTheme="majorEastAsia" w:hAnsiTheme="majorHAnsi" w:cstheme="majorBidi"/>
+      <w:rFonts w:ascii="Times New Roman" w:hAnsi="Times New Roman" w:eastAsia="Times New Roman" w:cs="Times New Roman"/>
       <w:color w:val="243F60" w:themeColor="accent1" w:themeShade="7F"/>
     </w:rPr>
   </w:style>
@@ -2045,7 +2166,7 @@
       <w:outlineLvl w:val="5"/>
     </w:pPr>
     <w:rPr>
-      <w:rFonts w:asciiTheme="majorHAnsi" w:eastAsiaTheme="majorEastAsia" w:hAnsiTheme="majorHAnsi" w:cstheme="majorBidi"/>
+      <w:rFonts w:ascii="Times New Roman" w:hAnsi="Times New Roman" w:eastAsia="Times New Roman" w:cs="Times New Roman"/>
       <w:i/>
       <w:iCs/>
       <w:color w:val="243F60" w:themeColor="accent1" w:themeShade="7F"/>
@@ -2068,7 +2189,7 @@
       <w:outlineLvl w:val="6"/>
     </w:pPr>
     <w:rPr>
-      <w:rFonts w:asciiTheme="majorHAnsi" w:eastAsiaTheme="majorEastAsia" w:hAnsiTheme="majorHAnsi" w:cstheme="majorBidi"/>
+      <w:rFonts w:ascii="Times New Roman" w:hAnsi="Times New Roman" w:eastAsia="Times New Roman" w:cs="Times New Roman"/>
       <w:i/>
       <w:iCs/>
       <w:color w:val="404040" w:themeColor="text1" w:themeTint="BF"/>
@@ -2091,7 +2212,7 @@
       <w:outlineLvl w:val="7"/>
     </w:pPr>
     <w:rPr>
-      <w:rFonts w:asciiTheme="majorHAnsi" w:eastAsiaTheme="majorEastAsia" w:hAnsiTheme="majorHAnsi" w:cstheme="majorBidi"/>
+      <w:rFonts w:ascii="Times New Roman" w:hAnsi="Times New Roman" w:eastAsia="Times New Roman" w:cs="Times New Roman"/>
       <w:color w:val="4F81BD" w:themeColor="accent1"/>
       <w:sz w:val="20"/>
       <w:szCs w:val="20"/>
@@ -2114,7 +2235,7 @@
       <w:outlineLvl w:val="8"/>
     </w:pPr>
     <w:rPr>
-      <w:rFonts w:asciiTheme="majorHAnsi" w:eastAsiaTheme="majorEastAsia" w:hAnsiTheme="majorHAnsi" w:cstheme="majorBidi"/>
+      <w:rFonts w:ascii="Times New Roman" w:hAnsi="Times New Roman" w:eastAsia="Times New Roman" w:cs="Times New Roman"/>
       <w:i/>
       <w:iCs/>
       <w:color w:val="404040" w:themeColor="text1" w:themeTint="BF"/>
@@ -2127,12 +2248,18 @@
     <w:uiPriority w:val="1"/>
     <w:semiHidden/>
     <w:unhideWhenUsed/>
+    <w:rPr>
+      <w:rFonts w:ascii="Times New Roman" w:hAnsi="Times New Roman" w:eastAsia="Times New Roman" w:cs="Times New Roman"/>
+    </w:rPr>
   </w:style>
   <w:style w:type="table" w:default="1" w:styleId="TableNormal">
     <w:name w:val="Normal Table"/>
     <w:uiPriority w:val="99"/>
     <w:semiHidden/>
     <w:unhideWhenUsed/>
+    <w:rPr>
+      <w:rFonts w:ascii="Times New Roman" w:hAnsi="Times New Roman" w:eastAsia="Times New Roman" w:cs="Times New Roman"/>
+    </w:rPr>
     <w:tblPr>
       <w:tblInd w:w="0" w:type="dxa"/>
       <w:tblCellMar>
@@ -2157,6 +2284,9 @@
     <w:pPr>
       <w:spacing w:after="0" w:line="240" w:lineRule="auto"/>
     </w:pPr>
+    <w:rPr>
+      <w:rFonts w:ascii="Times New Roman" w:hAnsi="Times New Roman" w:eastAsia="Times New Roman" w:cs="Times New Roman"/>
+    </w:rPr>
   </w:style>
   <w:style w:type="character" w:customStyle="1" w:styleId="Heading1Char">
     <w:name w:val="Heading 1 Char"/>
@@ -2165,7 +2295,7 @@
     <w:uiPriority w:val="9"/>
     <w:rsid w:val="00FC693F"/>
     <w:rPr>
-      <w:rFonts w:asciiTheme="majorHAnsi" w:eastAsiaTheme="majorEastAsia" w:hAnsiTheme="majorHAnsi" w:cstheme="majorBidi"/>
+      <w:rFonts w:ascii="Times New Roman" w:hAnsi="Times New Roman" w:eastAsia="Times New Roman" w:cs="Times New Roman"/>
       <w:b/>
       <w:bCs/>
       <w:color w:val="365F91" w:themeColor="accent1" w:themeShade="BF"/>
@@ -2180,7 +2310,7 @@
     <w:uiPriority w:val="9"/>
     <w:rsid w:val="00FC693F"/>
     <w:rPr>
-      <w:rFonts w:asciiTheme="majorHAnsi" w:eastAsiaTheme="majorEastAsia" w:hAnsiTheme="majorHAnsi" w:cstheme="majorBidi"/>
+      <w:rFonts w:ascii="Times New Roman" w:hAnsi="Times New Roman" w:eastAsia="Times New Roman" w:cs="Times New Roman"/>
       <w:b/>
       <w:bCs/>
       <w:color w:val="4F81BD" w:themeColor="accent1"/>
@@ -2195,7 +2325,7 @@
     <w:uiPriority w:val="9"/>
     <w:rsid w:val="00FC693F"/>
     <w:rPr>
-      <w:rFonts w:asciiTheme="majorHAnsi" w:eastAsiaTheme="majorEastAsia" w:hAnsiTheme="majorHAnsi" w:cstheme="majorBidi"/>
+      <w:rFonts w:ascii="Times New Roman" w:hAnsi="Times New Roman" w:eastAsia="Times New Roman" w:cs="Times New Roman"/>
       <w:b/>
       <w:bCs/>
       <w:color w:val="4F81BD" w:themeColor="accent1"/>
@@ -2217,7 +2347,7 @@
       <w:contextualSpacing/>
     </w:pPr>
     <w:rPr>
-      <w:rFonts w:asciiTheme="majorHAnsi" w:eastAsiaTheme="majorEastAsia" w:hAnsiTheme="majorHAnsi" w:cstheme="majorBidi"/>
+      <w:rFonts w:ascii="Times New Roman" w:hAnsi="Times New Roman" w:eastAsia="Times New Roman" w:cs="Times New Roman"/>
       <w:color w:val="17365D" w:themeColor="text2" w:themeShade="BF"/>
       <w:spacing w:val="5"/>
       <w:kern w:val="28"/>
@@ -2232,7 +2362,7 @@
     <w:uiPriority w:val="10"/>
     <w:rsid w:val="00FC693F"/>
     <w:rPr>
-      <w:rFonts w:asciiTheme="majorHAnsi" w:eastAsiaTheme="majorEastAsia" w:hAnsiTheme="majorHAnsi" w:cstheme="majorBidi"/>
+      <w:rFonts w:ascii="Times New Roman" w:hAnsi="Times New Roman" w:eastAsia="Times New Roman" w:cs="Times New Roman"/>
       <w:color w:val="17365D" w:themeColor="text2" w:themeShade="BF"/>
       <w:spacing w:val="5"/>
       <w:kern w:val="28"/>
@@ -2254,7 +2384,7 @@
       </w:numPr>
     </w:pPr>
     <w:rPr>
-      <w:rFonts w:asciiTheme="majorHAnsi" w:eastAsiaTheme="majorEastAsia" w:hAnsiTheme="majorHAnsi" w:cstheme="majorBidi"/>
+      <w:rFonts w:ascii="Times New Roman" w:hAnsi="Times New Roman" w:eastAsia="Times New Roman" w:cs="Times New Roman"/>
       <w:i/>
       <w:iCs/>
       <w:color w:val="4F81BD" w:themeColor="accent1"/>
@@ -2270,7 +2400,7 @@
     <w:uiPriority w:val="11"/>
     <w:rsid w:val="00FC693F"/>
     <w:rPr>
-      <w:rFonts w:asciiTheme="majorHAnsi" w:eastAsiaTheme="majorEastAsia" w:hAnsiTheme="majorHAnsi" w:cstheme="majorBidi"/>
+      <w:rFonts w:ascii="Times New Roman" w:hAnsi="Times New Roman" w:eastAsia="Times New Roman" w:cs="Times New Roman"/>
       <w:i/>
       <w:iCs/>
       <w:color w:val="4F81BD" w:themeColor="accent1"/>
@@ -2289,6 +2419,9 @@
       <w:ind w:left="720"/>
       <w:contextualSpacing/>
     </w:pPr>
+    <w:rPr>
+      <w:rFonts w:ascii="Times New Roman" w:hAnsi="Times New Roman" w:eastAsia="Times New Roman" w:cs="Times New Roman"/>
+    </w:rPr>
   </w:style>
   <w:style w:type="paragraph" w:styleId="BodyText">
     <w:name w:val="Body Text"/>
@@ -2300,6 +2433,9 @@
     <w:pPr>
       <w:spacing w:after="120"/>
     </w:pPr>
+    <w:rPr>
+      <w:rFonts w:ascii="Times New Roman" w:hAnsi="Times New Roman" w:eastAsia="Times New Roman" w:cs="Times New Roman"/>
+    </w:rPr>
   </w:style>
   <w:style w:type="character" w:customStyle="1" w:styleId="BodyTextChar">
     <w:name w:val="Body Text Char"/>
@@ -2307,6 +2443,9 @@
     <w:link w:val="BodyText"/>
     <w:uiPriority w:val="99"/>
     <w:rsid w:val="00AA1D8D"/>
+    <w:rPr>
+      <w:rFonts w:ascii="Times New Roman" w:hAnsi="Times New Roman" w:eastAsia="Times New Roman" w:cs="Times New Roman"/>
+    </w:rPr>
   </w:style>
   <w:style w:type="paragraph" w:styleId="BodyText2">
     <w:name w:val="Body Text 2"/>
@@ -2318,6 +2457,9 @@
     <w:pPr>
       <w:spacing w:after="120" w:line="480" w:lineRule="auto"/>
     </w:pPr>
+    <w:rPr>
+      <w:rFonts w:ascii="Times New Roman" w:hAnsi="Times New Roman" w:eastAsia="Times New Roman" w:cs="Times New Roman"/>
+    </w:rPr>
   </w:style>
   <w:style w:type="character" w:customStyle="1" w:styleId="BodyText2Char">
     <w:name w:val="Body Text 2 Char"/>
@@ -2325,6 +2467,9 @@
     <w:link w:val="BodyText2"/>
     <w:uiPriority w:val="99"/>
     <w:rsid w:val="00AA1D8D"/>
+    <w:rPr>
+      <w:rFonts w:ascii="Times New Roman" w:hAnsi="Times New Roman" w:eastAsia="Times New Roman" w:cs="Times New Roman"/>
+    </w:rPr>
   </w:style>
   <w:style w:type="paragraph" w:styleId="BodyText3">
     <w:name w:val="Body Text 3"/>
@@ -2337,6 +2482,7 @@
       <w:spacing w:after="120"/>
     </w:pPr>
     <w:rPr>
+      <w:rFonts w:ascii="Times New Roman" w:hAnsi="Times New Roman" w:eastAsia="Times New Roman" w:cs="Times New Roman"/>
       <w:sz w:val="16"/>
       <w:szCs w:val="16"/>
     </w:rPr>
@@ -2348,6 +2494,7 @@
     <w:uiPriority w:val="99"/>
     <w:rsid w:val="00AA1D8D"/>
     <w:rPr>
+      <w:rFonts w:ascii="Times New Roman" w:hAnsi="Times New Roman" w:eastAsia="Times New Roman" w:cs="Times New Roman"/>
       <w:sz w:val="16"/>
       <w:szCs w:val="16"/>
     </w:rPr>
@@ -2362,6 +2509,9 @@
       <w:ind w:left="360" w:hanging="360"/>
       <w:contextualSpacing/>
     </w:pPr>
+    <w:rPr>
+      <w:rFonts w:ascii="Times New Roman" w:hAnsi="Times New Roman" w:eastAsia="Times New Roman" w:cs="Times New Roman"/>
+    </w:rPr>
   </w:style>
   <w:style w:type="paragraph" w:styleId="List2">
     <w:name w:val="List 2"/>
@@ -2373,6 +2523,9 @@
       <w:ind w:left="720" w:hanging="360"/>
       <w:contextualSpacing/>
     </w:pPr>
+    <w:rPr>
+      <w:rFonts w:ascii="Times New Roman" w:hAnsi="Times New Roman" w:eastAsia="Times New Roman" w:cs="Times New Roman"/>
+    </w:rPr>
   </w:style>
   <w:style w:type="paragraph" w:styleId="List3">
     <w:name w:val="List 3"/>
@@ -2384,6 +2537,9 @@
       <w:ind w:left="1080" w:hanging="360"/>
       <w:contextualSpacing/>
     </w:pPr>
+    <w:rPr>
+      <w:rFonts w:ascii="Times New Roman" w:hAnsi="Times New Roman" w:eastAsia="Times New Roman" w:cs="Times New Roman"/>
+    </w:rPr>
   </w:style>
   <w:style w:type="paragraph" w:styleId="ListBullet">
     <w:name w:val="List Bullet"/>
@@ -2397,6 +2553,9 @@
       </w:numPr>
       <w:contextualSpacing/>
     </w:pPr>
+    <w:rPr>
+      <w:rFonts w:ascii="Times New Roman" w:hAnsi="Times New Roman" w:eastAsia="Times New Roman" w:cs="Times New Roman"/>
+    </w:rPr>
   </w:style>
   <w:style w:type="paragraph" w:styleId="ListBullet2">
     <w:name w:val="List Bullet 2"/>
@@ -2410,6 +2569,9 @@
       </w:numPr>
       <w:contextualSpacing/>
     </w:pPr>
+    <w:rPr>
+      <w:rFonts w:ascii="Times New Roman" w:hAnsi="Times New Roman" w:eastAsia="Times New Roman" w:cs="Times New Roman"/>
+    </w:rPr>
   </w:style>
   <w:style w:type="paragraph" w:styleId="ListBullet3">
     <w:name w:val="List Bullet 3"/>
@@ -2423,6 +2585,9 @@
       </w:numPr>
       <w:contextualSpacing/>
     </w:pPr>
+    <w:rPr>
+      <w:rFonts w:ascii="Times New Roman" w:hAnsi="Times New Roman" w:eastAsia="Times New Roman" w:cs="Times New Roman"/>
+    </w:rPr>
   </w:style>
   <w:style w:type="paragraph" w:styleId="ListNumber">
     <w:name w:val="List Number"/>
@@ -2436,6 +2601,9 @@
       </w:numPr>
       <w:contextualSpacing/>
     </w:pPr>
+    <w:rPr>
+      <w:rFonts w:ascii="Times New Roman" w:hAnsi="Times New Roman" w:eastAsia="Times New Roman" w:cs="Times New Roman"/>
+    </w:rPr>
   </w:style>
   <w:style w:type="paragraph" w:styleId="ListNumber2">
     <w:name w:val="List Number 2"/>
@@ -2449,6 +2617,9 @@
       </w:numPr>
       <w:contextualSpacing/>
     </w:pPr>
+    <w:rPr>
+      <w:rFonts w:ascii="Times New Roman" w:hAnsi="Times New Roman" w:eastAsia="Times New Roman" w:cs="Times New Roman"/>
+    </w:rPr>
   </w:style>
   <w:style w:type="paragraph" w:styleId="ListNumber3">
     <w:name w:val="List Number 3"/>
@@ -2462,6 +2633,9 @@
       </w:numPr>
       <w:contextualSpacing/>
     </w:pPr>
+    <w:rPr>
+      <w:rFonts w:ascii="Times New Roman" w:hAnsi="Times New Roman" w:eastAsia="Times New Roman" w:cs="Times New Roman"/>
+    </w:rPr>
   </w:style>
   <w:style w:type="paragraph" w:styleId="ListContinue">
     <w:name w:val="List Continue"/>
@@ -2474,6 +2648,9 @@
       <w:ind w:left="360"/>
       <w:contextualSpacing/>
     </w:pPr>
+    <w:rPr>
+      <w:rFonts w:ascii="Times New Roman" w:hAnsi="Times New Roman" w:eastAsia="Times New Roman" w:cs="Times New Roman"/>
+    </w:rPr>
   </w:style>
   <w:style w:type="paragraph" w:styleId="ListContinue2">
     <w:name w:val="List Continue 2"/>
@@ -2486,6 +2663,9 @@
       <w:ind w:left="720"/>
       <w:contextualSpacing/>
     </w:pPr>
+    <w:rPr>
+      <w:rFonts w:ascii="Times New Roman" w:hAnsi="Times New Roman" w:eastAsia="Times New Roman" w:cs="Times New Roman"/>
+    </w:rPr>
   </w:style>
   <w:style w:type="paragraph" w:styleId="ListContinue3">
     <w:name w:val="List Continue 3"/>
@@ -2498,6 +2678,9 @@
       <w:ind w:left="1080"/>
       <w:contextualSpacing/>
     </w:pPr>
+    <w:rPr>
+      <w:rFonts w:ascii="Times New Roman" w:hAnsi="Times New Roman" w:eastAsia="Times New Roman" w:cs="Times New Roman"/>
+    </w:rPr>
   </w:style>
   <w:style w:type="paragraph" w:styleId="MacroText">
     <w:name w:val="macro"/>
@@ -2517,7 +2700,7 @@
       </w:tabs>
     </w:pPr>
     <w:rPr>
-      <w:rFonts w:ascii="Courier" w:hAnsi="Courier"/>
+      <w:rFonts w:ascii="Times New Roman" w:hAnsi="Times New Roman" w:eastAsia="Times New Roman" w:cs="Times New Roman"/>
       <w:sz w:val="20"/>
       <w:szCs w:val="20"/>
     </w:rPr>
@@ -2529,7 +2712,7 @@
     <w:uiPriority w:val="99"/>
     <w:rsid w:val="0029639D"/>
     <w:rPr>
-      <w:rFonts w:ascii="Courier" w:hAnsi="Courier"/>
+      <w:rFonts w:ascii="Times New Roman" w:hAnsi="Times New Roman" w:eastAsia="Times New Roman" w:cs="Times New Roman"/>
       <w:sz w:val="20"/>
       <w:szCs w:val="20"/>
     </w:rPr>
@@ -2543,6 +2726,7 @@
     <w:qFormat/>
     <w:rsid w:val="00FC693F"/>
     <w:rPr>
+      <w:rFonts w:ascii="Times New Roman" w:hAnsi="Times New Roman" w:eastAsia="Times New Roman" w:cs="Times New Roman"/>
       <w:i/>
       <w:iCs/>
       <w:color w:val="000000" w:themeColor="text1"/>
@@ -2555,6 +2739,7 @@
     <w:uiPriority w:val="29"/>
     <w:rsid w:val="00FC693F"/>
     <w:rPr>
+      <w:rFonts w:ascii="Times New Roman" w:hAnsi="Times New Roman" w:eastAsia="Times New Roman" w:cs="Times New Roman"/>
       <w:i/>
       <w:iCs/>
       <w:color w:val="000000" w:themeColor="text1"/>
@@ -2568,7 +2753,7 @@
     <w:semiHidden/>
     <w:rsid w:val="00FC693F"/>
     <w:rPr>
-      <w:rFonts w:asciiTheme="majorHAnsi" w:eastAsiaTheme="majorEastAsia" w:hAnsiTheme="majorHAnsi" w:cstheme="majorBidi"/>
+      <w:rFonts w:ascii="Times New Roman" w:hAnsi="Times New Roman" w:eastAsia="Times New Roman" w:cs="Times New Roman"/>
       <w:b/>
       <w:bCs/>
       <w:i/>
@@ -2584,7 +2769,7 @@
     <w:semiHidden/>
     <w:rsid w:val="00FC693F"/>
     <w:rPr>
-      <w:rFonts w:asciiTheme="majorHAnsi" w:eastAsiaTheme="majorEastAsia" w:hAnsiTheme="majorHAnsi" w:cstheme="majorBidi"/>
+      <w:rFonts w:ascii="Times New Roman" w:hAnsi="Times New Roman" w:eastAsia="Times New Roman" w:cs="Times New Roman"/>
       <w:color w:val="243F60" w:themeColor="accent1" w:themeShade="7F"/>
     </w:rPr>
   </w:style>
@@ -2596,7 +2781,7 @@
     <w:semiHidden/>
     <w:rsid w:val="00FC693F"/>
     <w:rPr>
-      <w:rFonts w:asciiTheme="majorHAnsi" w:eastAsiaTheme="majorEastAsia" w:hAnsiTheme="majorHAnsi" w:cstheme="majorBidi"/>
+      <w:rFonts w:ascii="Times New Roman" w:hAnsi="Times New Roman" w:eastAsia="Times New Roman" w:cs="Times New Roman"/>
       <w:i/>
       <w:iCs/>
       <w:color w:val="243F60" w:themeColor="accent1" w:themeShade="7F"/>
@@ -2610,7 +2795,7 @@
     <w:semiHidden/>
     <w:rsid w:val="00FC693F"/>
     <w:rPr>
-      <w:rFonts w:asciiTheme="majorHAnsi" w:eastAsiaTheme="majorEastAsia" w:hAnsiTheme="majorHAnsi" w:cstheme="majorBidi"/>
+      <w:rFonts w:ascii="Times New Roman" w:hAnsi="Times New Roman" w:eastAsia="Times New Roman" w:cs="Times New Roman"/>
       <w:i/>
       <w:iCs/>
       <w:color w:val="404040" w:themeColor="text1" w:themeTint="BF"/>
@@ -2624,7 +2809,7 @@
     <w:semiHidden/>
     <w:rsid w:val="00FC693F"/>
     <w:rPr>
-      <w:rFonts w:asciiTheme="majorHAnsi" w:eastAsiaTheme="majorEastAsia" w:hAnsiTheme="majorHAnsi" w:cstheme="majorBidi"/>
+      <w:rFonts w:ascii="Times New Roman" w:hAnsi="Times New Roman" w:eastAsia="Times New Roman" w:cs="Times New Roman"/>
       <w:color w:val="4F81BD" w:themeColor="accent1"/>
       <w:sz w:val="20"/>
       <w:szCs w:val="20"/>
@@ -2638,7 +2823,7 @@
     <w:semiHidden/>
     <w:rsid w:val="00FC693F"/>
     <w:rPr>
-      <w:rFonts w:asciiTheme="majorHAnsi" w:eastAsiaTheme="majorEastAsia" w:hAnsiTheme="majorHAnsi" w:cstheme="majorBidi"/>
+      <w:rFonts w:ascii="Times New Roman" w:hAnsi="Times New Roman" w:eastAsia="Times New Roman" w:cs="Times New Roman"/>
       <w:i/>
       <w:iCs/>
       <w:color w:val="404040" w:themeColor="text1" w:themeTint="BF"/>
@@ -2659,6 +2844,7 @@
       <w:spacing w:line="240" w:lineRule="auto"/>
     </w:pPr>
     <w:rPr>
+      <w:rFonts w:ascii="Times New Roman" w:hAnsi="Times New Roman" w:eastAsia="Times New Roman" w:cs="Times New Roman"/>
       <w:b/>
       <w:bCs/>
       <w:color w:val="4F81BD" w:themeColor="accent1"/>
@@ -2673,6 +2859,7 @@
     <w:qFormat/>
     <w:rsid w:val="00FC693F"/>
     <w:rPr>
+      <w:rFonts w:ascii="Times New Roman" w:hAnsi="Times New Roman" w:eastAsia="Times New Roman" w:cs="Times New Roman"/>
       <w:b/>
       <w:bCs/>
     </w:rPr>
@@ -2684,6 +2871,7 @@
     <w:qFormat/>
     <w:rsid w:val="00FC693F"/>
     <w:rPr>
+      <w:rFonts w:ascii="Times New Roman" w:hAnsi="Times New Roman" w:eastAsia="Times New Roman" w:cs="Times New Roman"/>
       <w:i/>
       <w:iCs/>
     </w:rPr>
@@ -2704,6 +2892,7 @@
       <w:ind w:left="936" w:right="936"/>
     </w:pPr>
     <w:rPr>
+      <w:rFonts w:ascii="Times New Roman" w:hAnsi="Times New Roman" w:eastAsia="Times New Roman" w:cs="Times New Roman"/>
       <w:b/>
       <w:bCs/>
       <w:i/>
@@ -2718,6 +2907,7 @@
     <w:uiPriority w:val="30"/>
     <w:rsid w:val="00FC693F"/>
     <w:rPr>
+      <w:rFonts w:ascii="Times New Roman" w:hAnsi="Times New Roman" w:eastAsia="Times New Roman" w:cs="Times New Roman"/>
       <w:b/>
       <w:bCs/>
       <w:i/>
@@ -2732,6 +2922,7 @@
     <w:qFormat/>
     <w:rsid w:val="00FC693F"/>
     <w:rPr>
+      <w:rFonts w:ascii="Times New Roman" w:hAnsi="Times New Roman" w:eastAsia="Times New Roman" w:cs="Times New Roman"/>
       <w:i/>
       <w:iCs/>
       <w:color w:val="808080" w:themeColor="text1" w:themeTint="7F"/>
@@ -2744,6 +2935,7 @@
     <w:qFormat/>
     <w:rsid w:val="00FC693F"/>
     <w:rPr>
+      <w:rFonts w:ascii="Times New Roman" w:hAnsi="Times New Roman" w:eastAsia="Times New Roman" w:cs="Times New Roman"/>
       <w:b/>
       <w:bCs/>
       <w:i/>
@@ -2758,6 +2950,7 @@
     <w:qFormat/>
     <w:rsid w:val="00FC693F"/>
     <w:rPr>
+      <w:rFonts w:ascii="Times New Roman" w:hAnsi="Times New Roman" w:eastAsia="Times New Roman" w:cs="Times New Roman"/>
       <w:smallCaps/>
       <w:color w:val="C0504D" w:themeColor="accent2"/>
       <w:u w:val="single"/>
@@ -2770,6 +2963,7 @@
     <w:qFormat/>
     <w:rsid w:val="00FC693F"/>
     <w:rPr>
+      <w:rFonts w:ascii="Times New Roman" w:hAnsi="Times New Roman" w:eastAsia="Times New Roman" w:cs="Times New Roman"/>
       <w:b/>
       <w:bCs/>
       <w:smallCaps/>
@@ -2785,6 +2979,7 @@
     <w:qFormat/>
     <w:rsid w:val="00FC693F"/>
     <w:rPr>
+      <w:rFonts w:ascii="Times New Roman" w:hAnsi="Times New Roman" w:eastAsia="Times New Roman" w:cs="Times New Roman"/>
       <w:b/>
       <w:bCs/>
       <w:smallCaps/>
@@ -2803,6 +2998,9 @@
     <w:pPr>
       <w:outlineLvl w:val="9"/>
     </w:pPr>
+    <w:rPr>
+      <w:rFonts w:ascii="Times New Roman" w:hAnsi="Times New Roman" w:eastAsia="Times New Roman" w:cs="Times New Roman"/>
+    </w:rPr>
   </w:style>
   <w:style w:type="table" w:styleId="TableGrid">
     <w:name w:val="Table Grid"/>
@@ -2812,6 +3010,9 @@
     <w:pPr>
       <w:spacing w:after="0" w:line="240" w:lineRule="auto"/>
     </w:pPr>
+    <w:rPr>
+      <w:rFonts w:ascii="Times New Roman" w:hAnsi="Times New Roman" w:eastAsia="Times New Roman" w:cs="Times New Roman"/>
+    </w:rPr>
     <w:tblPr>
       <w:tblInd w:w="0" w:type="dxa"/>
       <w:tblBorders>
@@ -2839,6 +3040,7 @@
       <w:spacing w:after="0" w:line="240" w:lineRule="auto"/>
     </w:pPr>
     <w:rPr>
+      <w:rFonts w:ascii="Times New Roman" w:hAnsi="Times New Roman" w:eastAsia="Times New Roman" w:cs="Times New Roman"/>
       <w:color w:val="000000" w:themeColor="text1" w:themeShade="BF"/>
     </w:rPr>
     <w:tblPr>
@@ -2942,6 +3144,7 @@
       <w:spacing w:after="0" w:line="240" w:lineRule="auto"/>
     </w:pPr>
     <w:rPr>
+      <w:rFonts w:ascii="Times New Roman" w:hAnsi="Times New Roman" w:eastAsia="Times New Roman" w:cs="Times New Roman"/>
       <w:color w:val="365F91" w:themeColor="accent1" w:themeShade="BF"/>
     </w:rPr>
     <w:tblPr>
@@ -3045,6 +3248,7 @@
       <w:spacing w:after="0" w:line="240" w:lineRule="auto"/>
     </w:pPr>
     <w:rPr>
+      <w:rFonts w:ascii="Times New Roman" w:hAnsi="Times New Roman" w:eastAsia="Times New Roman" w:cs="Times New Roman"/>
       <w:color w:val="943634" w:themeColor="accent2" w:themeShade="BF"/>
     </w:rPr>
     <w:tblPr>
@@ -3148,6 +3352,7 @@
       <w:spacing w:after="0" w:line="240" w:lineRule="auto"/>
     </w:pPr>
     <w:rPr>
+      <w:rFonts w:ascii="Times New Roman" w:hAnsi="Times New Roman" w:eastAsia="Times New Roman" w:cs="Times New Roman"/>
       <w:color w:val="76923C" w:themeColor="accent3" w:themeShade="BF"/>
     </w:rPr>
     <w:tblPr>
@@ -3251,6 +3456,7 @@
       <w:spacing w:after="0" w:line="240" w:lineRule="auto"/>
     </w:pPr>
     <w:rPr>
+      <w:rFonts w:ascii="Times New Roman" w:hAnsi="Times New Roman" w:eastAsia="Times New Roman" w:cs="Times New Roman"/>
       <w:color w:val="5F497A" w:themeColor="accent4" w:themeShade="BF"/>
     </w:rPr>
     <w:tblPr>
@@ -3354,6 +3560,7 @@
       <w:spacing w:after="0" w:line="240" w:lineRule="auto"/>
     </w:pPr>
     <w:rPr>
+      <w:rFonts w:ascii="Times New Roman" w:hAnsi="Times New Roman" w:eastAsia="Times New Roman" w:cs="Times New Roman"/>
       <w:color w:val="31849B" w:themeColor="accent5" w:themeShade="BF"/>
     </w:rPr>
     <w:tblPr>
@@ -3457,6 +3664,7 @@
       <w:spacing w:after="0" w:line="240" w:lineRule="auto"/>
     </w:pPr>
     <w:rPr>
+      <w:rFonts w:ascii="Times New Roman" w:hAnsi="Times New Roman" w:eastAsia="Times New Roman" w:cs="Times New Roman"/>
       <w:color w:val="E36C0A" w:themeColor="accent6" w:themeShade="BF"/>
     </w:rPr>
     <w:tblPr>
@@ -3559,6 +3767,9 @@
     <w:pPr>
       <w:spacing w:after="0" w:line="240" w:lineRule="auto"/>
     </w:pPr>
+    <w:rPr>
+      <w:rFonts w:ascii="Times New Roman" w:hAnsi="Times New Roman" w:eastAsia="Times New Roman" w:cs="Times New Roman"/>
+    </w:rPr>
     <w:tblPr>
       <w:tblStyleRowBandSize w:val="1"/>
       <w:tblStyleColBandSize w:val="1"/>
@@ -3651,6 +3862,9 @@
     <w:pPr>
       <w:spacing w:after="0" w:line="240" w:lineRule="auto"/>
     </w:pPr>
+    <w:rPr>
+      <w:rFonts w:ascii="Times New Roman" w:hAnsi="Times New Roman" w:eastAsia="Times New Roman" w:cs="Times New Roman"/>
+    </w:rPr>
     <w:tblPr>
       <w:tblStyleRowBandSize w:val="1"/>
       <w:tblStyleColBandSize w:val="1"/>
@@ -3743,6 +3957,9 @@
     <w:pPr>
       <w:spacing w:after="0" w:line="240" w:lineRule="auto"/>
     </w:pPr>
+    <w:rPr>
+      <w:rFonts w:ascii="Times New Roman" w:hAnsi="Times New Roman" w:eastAsia="Times New Roman" w:cs="Times New Roman"/>
+    </w:rPr>
     <w:tblPr>
       <w:tblStyleRowBandSize w:val="1"/>
       <w:tblStyleColBandSize w:val="1"/>
@@ -3835,6 +4052,9 @@
     <w:pPr>
       <w:spacing w:after="0" w:line="240" w:lineRule="auto"/>
     </w:pPr>
+    <w:rPr>
+      <w:rFonts w:ascii="Times New Roman" w:hAnsi="Times New Roman" w:eastAsia="Times New Roman" w:cs="Times New Roman"/>
+    </w:rPr>
     <w:tblPr>
       <w:tblStyleRowBandSize w:val="1"/>
       <w:tblStyleColBandSize w:val="1"/>
@@ -3927,6 +4147,9 @@
     <w:pPr>
       <w:spacing w:after="0" w:line="240" w:lineRule="auto"/>
     </w:pPr>
+    <w:rPr>
+      <w:rFonts w:ascii="Times New Roman" w:hAnsi="Times New Roman" w:eastAsia="Times New Roman" w:cs="Times New Roman"/>
+    </w:rPr>
     <w:tblPr>
       <w:tblStyleRowBandSize w:val="1"/>
       <w:tblStyleColBandSize w:val="1"/>
@@ -4019,6 +4242,9 @@
     <w:pPr>
       <w:spacing w:after="0" w:line="240" w:lineRule="auto"/>
     </w:pPr>
+    <w:rPr>
+      <w:rFonts w:ascii="Times New Roman" w:hAnsi="Times New Roman" w:eastAsia="Times New Roman" w:cs="Times New Roman"/>
+    </w:rPr>
     <w:tblPr>
       <w:tblStyleRowBandSize w:val="1"/>
       <w:tblStyleColBandSize w:val="1"/>
@@ -4111,6 +4337,9 @@
     <w:pPr>
       <w:spacing w:after="0" w:line="240" w:lineRule="auto"/>
     </w:pPr>
+    <w:rPr>
+      <w:rFonts w:ascii="Times New Roman" w:hAnsi="Times New Roman" w:eastAsia="Times New Roman" w:cs="Times New Roman"/>
+    </w:rPr>
     <w:tblPr>
       <w:tblStyleRowBandSize w:val="1"/>
       <w:tblStyleColBandSize w:val="1"/>
@@ -4203,6 +4432,9 @@
     <w:pPr>
       <w:spacing w:after="0" w:line="240" w:lineRule="auto"/>
     </w:pPr>
+    <w:rPr>
+      <w:rFonts w:ascii="Times New Roman" w:hAnsi="Times New Roman" w:eastAsia="Times New Roman" w:cs="Times New Roman"/>
+    </w:rPr>
     <w:tblPr>
       <w:tblStyleRowBandSize w:val="1"/>
       <w:tblStyleColBandSize w:val="1"/>
@@ -4227,7 +4459,7 @@
         <w:spacing w:before="0" w:after="0" w:line="240" w:lineRule="auto"/>
       </w:pPr>
       <w:rPr>
-        <w:rFonts w:asciiTheme="majorHAnsi" w:eastAsiaTheme="majorEastAsia" w:hAnsiTheme="majorHAnsi" w:cstheme="majorBidi"/>
+        <w:rFonts w:ascii="Times New Roman" w:hAnsi="Times New Roman" w:eastAsia="Times New Roman" w:cs="Times New Roman"/>
         <w:b/>
         <w:bCs/>
       </w:rPr>
@@ -4248,7 +4480,7 @@
         <w:spacing w:before="0" w:after="0" w:line="240" w:lineRule="auto"/>
       </w:pPr>
       <w:rPr>
-        <w:rFonts w:asciiTheme="majorHAnsi" w:eastAsiaTheme="majorEastAsia" w:hAnsiTheme="majorHAnsi" w:cstheme="majorBidi"/>
+        <w:rFonts w:ascii="Times New Roman" w:hAnsi="Times New Roman" w:eastAsia="Times New Roman" w:cs="Times New Roman"/>
         <w:b/>
         <w:bCs/>
       </w:rPr>
@@ -4266,14 +4498,14 @@
     </w:tblStylePr>
     <w:tblStylePr w:type="firstCol">
       <w:rPr>
-        <w:rFonts w:asciiTheme="majorHAnsi" w:eastAsiaTheme="majorEastAsia" w:hAnsiTheme="majorHAnsi" w:cstheme="majorBidi"/>
+        <w:rFonts w:ascii="Times New Roman" w:hAnsi="Times New Roman" w:eastAsia="Times New Roman" w:cs="Times New Roman"/>
         <w:b/>
         <w:bCs/>
       </w:rPr>
     </w:tblStylePr>
     <w:tblStylePr w:type="lastCol">
       <w:rPr>
-        <w:rFonts w:asciiTheme="majorHAnsi" w:eastAsiaTheme="majorEastAsia" w:hAnsiTheme="majorHAnsi" w:cstheme="majorBidi"/>
+        <w:rFonts w:ascii="Times New Roman" w:hAnsi="Times New Roman" w:eastAsia="Times New Roman" w:cs="Times New Roman"/>
         <w:b/>
         <w:bCs/>
       </w:rPr>
@@ -4333,6 +4565,9 @@
     <w:pPr>
       <w:spacing w:after="0" w:line="240" w:lineRule="auto"/>
     </w:pPr>
+    <w:rPr>
+      <w:rFonts w:ascii="Times New Roman" w:hAnsi="Times New Roman" w:eastAsia="Times New Roman" w:cs="Times New Roman"/>
+    </w:rPr>
     <w:tblPr>
       <w:tblStyleRowBandSize w:val="1"/>
       <w:tblStyleColBandSize w:val="1"/>
@@ -4357,7 +4592,7 @@
         <w:spacing w:before="0" w:after="0" w:line="240" w:lineRule="auto"/>
       </w:pPr>
       <w:rPr>
-        <w:rFonts w:asciiTheme="majorHAnsi" w:eastAsiaTheme="majorEastAsia" w:hAnsiTheme="majorHAnsi" w:cstheme="majorBidi"/>
+        <w:rFonts w:ascii="Times New Roman" w:hAnsi="Times New Roman" w:eastAsia="Times New Roman" w:cs="Times New Roman"/>
         <w:b/>
         <w:bCs/>
       </w:rPr>
@@ -4378,7 +4613,7 @@
         <w:spacing w:before="0" w:after="0" w:line="240" w:lineRule="auto"/>
       </w:pPr>
       <w:rPr>
-        <w:rFonts w:asciiTheme="majorHAnsi" w:eastAsiaTheme="majorEastAsia" w:hAnsiTheme="majorHAnsi" w:cstheme="majorBidi"/>
+        <w:rFonts w:ascii="Times New Roman" w:hAnsi="Times New Roman" w:eastAsia="Times New Roman" w:cs="Times New Roman"/>
         <w:b/>
         <w:bCs/>
       </w:rPr>
@@ -4396,14 +4631,14 @@
     </w:tblStylePr>
     <w:tblStylePr w:type="firstCol">
       <w:rPr>
-        <w:rFonts w:asciiTheme="majorHAnsi" w:eastAsiaTheme="majorEastAsia" w:hAnsiTheme="majorHAnsi" w:cstheme="majorBidi"/>
+        <w:rFonts w:ascii="Times New Roman" w:hAnsi="Times New Roman" w:eastAsia="Times New Roman" w:cs="Times New Roman"/>
         <w:b/>
         <w:bCs/>
       </w:rPr>
     </w:tblStylePr>
     <w:tblStylePr w:type="lastCol">
       <w:rPr>
-        <w:rFonts w:asciiTheme="majorHAnsi" w:eastAsiaTheme="majorEastAsia" w:hAnsiTheme="majorHAnsi" w:cstheme="majorBidi"/>
+        <w:rFonts w:ascii="Times New Roman" w:hAnsi="Times New Roman" w:eastAsia="Times New Roman" w:cs="Times New Roman"/>
         <w:b/>
         <w:bCs/>
       </w:rPr>
@@ -4463,6 +4698,9 @@
     <w:pPr>
       <w:spacing w:after="0" w:line="240" w:lineRule="auto"/>
     </w:pPr>
+    <w:rPr>
+      <w:rFonts w:ascii="Times New Roman" w:hAnsi="Times New Roman" w:eastAsia="Times New Roman" w:cs="Times New Roman"/>
+    </w:rPr>
     <w:tblPr>
       <w:tblStyleRowBandSize w:val="1"/>
       <w:tblStyleColBandSize w:val="1"/>
@@ -4487,7 +4725,7 @@
         <w:spacing w:before="0" w:after="0" w:line="240" w:lineRule="auto"/>
       </w:pPr>
       <w:rPr>
-        <w:rFonts w:asciiTheme="majorHAnsi" w:eastAsiaTheme="majorEastAsia" w:hAnsiTheme="majorHAnsi" w:cstheme="majorBidi"/>
+        <w:rFonts w:ascii="Times New Roman" w:hAnsi="Times New Roman" w:eastAsia="Times New Roman" w:cs="Times New Roman"/>
         <w:b/>
         <w:bCs/>
       </w:rPr>
@@ -4508,7 +4746,7 @@
         <w:spacing w:before="0" w:after="0" w:line="240" w:lineRule="auto"/>
       </w:pPr>
       <w:rPr>
-        <w:rFonts w:asciiTheme="majorHAnsi" w:eastAsiaTheme="majorEastAsia" w:hAnsiTheme="majorHAnsi" w:cstheme="majorBidi"/>
+        <w:rFonts w:ascii="Times New Roman" w:hAnsi="Times New Roman" w:eastAsia="Times New Roman" w:cs="Times New Roman"/>
         <w:b/>
         <w:bCs/>
       </w:rPr>
@@ -4526,14 +4764,14 @@
     </w:tblStylePr>
     <w:tblStylePr w:type="firstCol">
       <w:rPr>
-        <w:rFonts w:asciiTheme="majorHAnsi" w:eastAsiaTheme="majorEastAsia" w:hAnsiTheme="majorHAnsi" w:cstheme="majorBidi"/>
+        <w:rFonts w:ascii="Times New Roman" w:hAnsi="Times New Roman" w:eastAsia="Times New Roman" w:cs="Times New Roman"/>
         <w:b/>
         <w:bCs/>
       </w:rPr>
     </w:tblStylePr>
     <w:tblStylePr w:type="lastCol">
       <w:rPr>
-        <w:rFonts w:asciiTheme="majorHAnsi" w:eastAsiaTheme="majorEastAsia" w:hAnsiTheme="majorHAnsi" w:cstheme="majorBidi"/>
+        <w:rFonts w:ascii="Times New Roman" w:hAnsi="Times New Roman" w:eastAsia="Times New Roman" w:cs="Times New Roman"/>
         <w:b/>
         <w:bCs/>
       </w:rPr>
@@ -4593,6 +4831,9 @@
     <w:pPr>
       <w:spacing w:after="0" w:line="240" w:lineRule="auto"/>
     </w:pPr>
+    <w:rPr>
+      <w:rFonts w:ascii="Times New Roman" w:hAnsi="Times New Roman" w:eastAsia="Times New Roman" w:cs="Times New Roman"/>
+    </w:rPr>
     <w:tblPr>
       <w:tblStyleRowBandSize w:val="1"/>
       <w:tblStyleColBandSize w:val="1"/>
@@ -4617,7 +4858,7 @@
         <w:spacing w:before="0" w:after="0" w:line="240" w:lineRule="auto"/>
       </w:pPr>
       <w:rPr>
-        <w:rFonts w:asciiTheme="majorHAnsi" w:eastAsiaTheme="majorEastAsia" w:hAnsiTheme="majorHAnsi" w:cstheme="majorBidi"/>
+        <w:rFonts w:ascii="Times New Roman" w:hAnsi="Times New Roman" w:eastAsia="Times New Roman" w:cs="Times New Roman"/>
         <w:b/>
         <w:bCs/>
       </w:rPr>
@@ -4638,7 +4879,7 @@
         <w:spacing w:before="0" w:after="0" w:line="240" w:lineRule="auto"/>
       </w:pPr>
       <w:rPr>
-        <w:rFonts w:asciiTheme="majorHAnsi" w:eastAsiaTheme="majorEastAsia" w:hAnsiTheme="majorHAnsi" w:cstheme="majorBidi"/>
+        <w:rFonts w:ascii="Times New Roman" w:hAnsi="Times New Roman" w:eastAsia="Times New Roman" w:cs="Times New Roman"/>
         <w:b/>
         <w:bCs/>
       </w:rPr>
@@ -4656,14 +4897,14 @@
     </w:tblStylePr>
     <w:tblStylePr w:type="firstCol">
       <w:rPr>
-        <w:rFonts w:asciiTheme="majorHAnsi" w:eastAsiaTheme="majorEastAsia" w:hAnsiTheme="majorHAnsi" w:cstheme="majorBidi"/>
+        <w:rFonts w:ascii="Times New Roman" w:hAnsi="Times New Roman" w:eastAsia="Times New Roman" w:cs="Times New Roman"/>
         <w:b/>
         <w:bCs/>
       </w:rPr>
     </w:tblStylePr>
     <w:tblStylePr w:type="lastCol">
       <w:rPr>
-        <w:rFonts w:asciiTheme="majorHAnsi" w:eastAsiaTheme="majorEastAsia" w:hAnsiTheme="majorHAnsi" w:cstheme="majorBidi"/>
+        <w:rFonts w:ascii="Times New Roman" w:hAnsi="Times New Roman" w:eastAsia="Times New Roman" w:cs="Times New Roman"/>
         <w:b/>
         <w:bCs/>
       </w:rPr>
@@ -4723,6 +4964,9 @@
     <w:pPr>
       <w:spacing w:after="0" w:line="240" w:lineRule="auto"/>
     </w:pPr>
+    <w:rPr>
+      <w:rFonts w:ascii="Times New Roman" w:hAnsi="Times New Roman" w:eastAsia="Times New Roman" w:cs="Times New Roman"/>
+    </w:rPr>
     <w:tblPr>
       <w:tblStyleRowBandSize w:val="1"/>
       <w:tblStyleColBandSize w:val="1"/>
@@ -4747,7 +4991,7 @@
         <w:spacing w:before="0" w:after="0" w:line="240" w:lineRule="auto"/>
       </w:pPr>
       <w:rPr>
-        <w:rFonts w:asciiTheme="majorHAnsi" w:eastAsiaTheme="majorEastAsia" w:hAnsiTheme="majorHAnsi" w:cstheme="majorBidi"/>
+        <w:rFonts w:ascii="Times New Roman" w:hAnsi="Times New Roman" w:eastAsia="Times New Roman" w:cs="Times New Roman"/>
         <w:b/>
         <w:bCs/>
       </w:rPr>
@@ -4768,7 +5012,7 @@
         <w:spacing w:before="0" w:after="0" w:line="240" w:lineRule="auto"/>
       </w:pPr>
       <w:rPr>
-        <w:rFonts w:asciiTheme="majorHAnsi" w:eastAsiaTheme="majorEastAsia" w:hAnsiTheme="majorHAnsi" w:cstheme="majorBidi"/>
+        <w:rFonts w:ascii="Times New Roman" w:hAnsi="Times New Roman" w:eastAsia="Times New Roman" w:cs="Times New Roman"/>
         <w:b/>
         <w:bCs/>
       </w:rPr>
@@ -4786,14 +5030,14 @@
     </w:tblStylePr>
     <w:tblStylePr w:type="firstCol">
       <w:rPr>
-        <w:rFonts w:asciiTheme="majorHAnsi" w:eastAsiaTheme="majorEastAsia" w:hAnsiTheme="majorHAnsi" w:cstheme="majorBidi"/>
+        <w:rFonts w:ascii="Times New Roman" w:hAnsi="Times New Roman" w:eastAsia="Times New Roman" w:cs="Times New Roman"/>
         <w:b/>
         <w:bCs/>
       </w:rPr>
     </w:tblStylePr>
     <w:tblStylePr w:type="lastCol">
       <w:rPr>
-        <w:rFonts w:asciiTheme="majorHAnsi" w:eastAsiaTheme="majorEastAsia" w:hAnsiTheme="majorHAnsi" w:cstheme="majorBidi"/>
+        <w:rFonts w:ascii="Times New Roman" w:hAnsi="Times New Roman" w:eastAsia="Times New Roman" w:cs="Times New Roman"/>
         <w:b/>
         <w:bCs/>
       </w:rPr>
@@ -4853,6 +5097,9 @@
     <w:pPr>
       <w:spacing w:after="0" w:line="240" w:lineRule="auto"/>
     </w:pPr>
+    <w:rPr>
+      <w:rFonts w:ascii="Times New Roman" w:hAnsi="Times New Roman" w:eastAsia="Times New Roman" w:cs="Times New Roman"/>
+    </w:rPr>
     <w:tblPr>
       <w:tblStyleRowBandSize w:val="1"/>
       <w:tblStyleColBandSize w:val="1"/>
@@ -4877,7 +5124,7 @@
         <w:spacing w:before="0" w:after="0" w:line="240" w:lineRule="auto"/>
       </w:pPr>
       <w:rPr>
-        <w:rFonts w:asciiTheme="majorHAnsi" w:eastAsiaTheme="majorEastAsia" w:hAnsiTheme="majorHAnsi" w:cstheme="majorBidi"/>
+        <w:rFonts w:ascii="Times New Roman" w:hAnsi="Times New Roman" w:eastAsia="Times New Roman" w:cs="Times New Roman"/>
         <w:b/>
         <w:bCs/>
       </w:rPr>
@@ -4898,7 +5145,7 @@
         <w:spacing w:before="0" w:after="0" w:line="240" w:lineRule="auto"/>
       </w:pPr>
       <w:rPr>
-        <w:rFonts w:asciiTheme="majorHAnsi" w:eastAsiaTheme="majorEastAsia" w:hAnsiTheme="majorHAnsi" w:cstheme="majorBidi"/>
+        <w:rFonts w:ascii="Times New Roman" w:hAnsi="Times New Roman" w:eastAsia="Times New Roman" w:cs="Times New Roman"/>
         <w:b/>
         <w:bCs/>
       </w:rPr>
@@ -4916,14 +5163,14 @@
     </w:tblStylePr>
     <w:tblStylePr w:type="firstCol">
       <w:rPr>
-        <w:rFonts w:asciiTheme="majorHAnsi" w:eastAsiaTheme="majorEastAsia" w:hAnsiTheme="majorHAnsi" w:cstheme="majorBidi"/>
+        <w:rFonts w:ascii="Times New Roman" w:hAnsi="Times New Roman" w:eastAsia="Times New Roman" w:cs="Times New Roman"/>
         <w:b/>
         <w:bCs/>
       </w:rPr>
     </w:tblStylePr>
     <w:tblStylePr w:type="lastCol">
       <w:rPr>
-        <w:rFonts w:asciiTheme="majorHAnsi" w:eastAsiaTheme="majorEastAsia" w:hAnsiTheme="majorHAnsi" w:cstheme="majorBidi"/>
+        <w:rFonts w:ascii="Times New Roman" w:hAnsi="Times New Roman" w:eastAsia="Times New Roman" w:cs="Times New Roman"/>
         <w:b/>
         <w:bCs/>
       </w:rPr>
@@ -4983,6 +5230,9 @@
     <w:pPr>
       <w:spacing w:after="0" w:line="240" w:lineRule="auto"/>
     </w:pPr>
+    <w:rPr>
+      <w:rFonts w:ascii="Times New Roman" w:hAnsi="Times New Roman" w:eastAsia="Times New Roman" w:cs="Times New Roman"/>
+    </w:rPr>
     <w:tblPr>
       <w:tblStyleRowBandSize w:val="1"/>
       <w:tblStyleColBandSize w:val="1"/>
@@ -5007,7 +5257,7 @@
         <w:spacing w:before="0" w:after="0" w:line="240" w:lineRule="auto"/>
       </w:pPr>
       <w:rPr>
-        <w:rFonts w:asciiTheme="majorHAnsi" w:eastAsiaTheme="majorEastAsia" w:hAnsiTheme="majorHAnsi" w:cstheme="majorBidi"/>
+        <w:rFonts w:ascii="Times New Roman" w:hAnsi="Times New Roman" w:eastAsia="Times New Roman" w:cs="Times New Roman"/>
         <w:b/>
         <w:bCs/>
       </w:rPr>
@@ -5028,7 +5278,7 @@
         <w:spacing w:before="0" w:after="0" w:line="240" w:lineRule="auto"/>
       </w:pPr>
       <w:rPr>
-        <w:rFonts w:asciiTheme="majorHAnsi" w:eastAsiaTheme="majorEastAsia" w:hAnsiTheme="majorHAnsi" w:cstheme="majorBidi"/>
+        <w:rFonts w:ascii="Times New Roman" w:hAnsi="Times New Roman" w:eastAsia="Times New Roman" w:cs="Times New Roman"/>
         <w:b/>
         <w:bCs/>
       </w:rPr>
@@ -5046,14 +5296,14 @@
     </w:tblStylePr>
     <w:tblStylePr w:type="firstCol">
       <w:rPr>
-        <w:rFonts w:asciiTheme="majorHAnsi" w:eastAsiaTheme="majorEastAsia" w:hAnsiTheme="majorHAnsi" w:cstheme="majorBidi"/>
+        <w:rFonts w:ascii="Times New Roman" w:hAnsi="Times New Roman" w:eastAsia="Times New Roman" w:cs="Times New Roman"/>
         <w:b/>
         <w:bCs/>
       </w:rPr>
     </w:tblStylePr>
     <w:tblStylePr w:type="lastCol">
       <w:rPr>
-        <w:rFonts w:asciiTheme="majorHAnsi" w:eastAsiaTheme="majorEastAsia" w:hAnsiTheme="majorHAnsi" w:cstheme="majorBidi"/>
+        <w:rFonts w:ascii="Times New Roman" w:hAnsi="Times New Roman" w:eastAsia="Times New Roman" w:cs="Times New Roman"/>
         <w:b/>
         <w:bCs/>
       </w:rPr>
@@ -5113,6 +5363,9 @@
     <w:pPr>
       <w:spacing w:after="0" w:line="240" w:lineRule="auto"/>
     </w:pPr>
+    <w:rPr>
+      <w:rFonts w:ascii="Times New Roman" w:hAnsi="Times New Roman" w:eastAsia="Times New Roman" w:cs="Times New Roman"/>
+    </w:rPr>
     <w:tblPr>
       <w:tblStyleRowBandSize w:val="1"/>
       <w:tblStyleColBandSize w:val="1"/>
@@ -5219,6 +5472,9 @@
     <w:pPr>
       <w:spacing w:after="0" w:line="240" w:lineRule="auto"/>
     </w:pPr>
+    <w:rPr>
+      <w:rFonts w:ascii="Times New Roman" w:hAnsi="Times New Roman" w:eastAsia="Times New Roman" w:cs="Times New Roman"/>
+    </w:rPr>
     <w:tblPr>
       <w:tblStyleRowBandSize w:val="1"/>
       <w:tblStyleColBandSize w:val="1"/>
@@ -5325,6 +5581,9 @@
     <w:pPr>
       <w:spacing w:after="0" w:line="240" w:lineRule="auto"/>
     </w:pPr>
+    <w:rPr>
+      <w:rFonts w:ascii="Times New Roman" w:hAnsi="Times New Roman" w:eastAsia="Times New Roman" w:cs="Times New Roman"/>
+    </w:rPr>
     <w:tblPr>
       <w:tblStyleRowBandSize w:val="1"/>
       <w:tblStyleColBandSize w:val="1"/>
@@ -5431,6 +5690,9 @@
     <w:pPr>
       <w:spacing w:after="0" w:line="240" w:lineRule="auto"/>
     </w:pPr>
+    <w:rPr>
+      <w:rFonts w:ascii="Times New Roman" w:hAnsi="Times New Roman" w:eastAsia="Times New Roman" w:cs="Times New Roman"/>
+    </w:rPr>
     <w:tblPr>
       <w:tblStyleRowBandSize w:val="1"/>
       <w:tblStyleColBandSize w:val="1"/>
@@ -5537,6 +5799,9 @@
     <w:pPr>
       <w:spacing w:after="0" w:line="240" w:lineRule="auto"/>
     </w:pPr>
+    <w:rPr>
+      <w:rFonts w:ascii="Times New Roman" w:hAnsi="Times New Roman" w:eastAsia="Times New Roman" w:cs="Times New Roman"/>
+    </w:rPr>
     <w:tblPr>
       <w:tblStyleRowBandSize w:val="1"/>
       <w:tblStyleColBandSize w:val="1"/>
@@ -5643,6 +5908,9 @@
     <w:pPr>
       <w:spacing w:after="0" w:line="240" w:lineRule="auto"/>
     </w:pPr>
+    <w:rPr>
+      <w:rFonts w:ascii="Times New Roman" w:hAnsi="Times New Roman" w:eastAsia="Times New Roman" w:cs="Times New Roman"/>
+    </w:rPr>
     <w:tblPr>
       <w:tblStyleRowBandSize w:val="1"/>
       <w:tblStyleColBandSize w:val="1"/>
@@ -5749,6 +6017,9 @@
     <w:pPr>
       <w:spacing w:after="0" w:line="240" w:lineRule="auto"/>
     </w:pPr>
+    <w:rPr>
+      <w:rFonts w:ascii="Times New Roman" w:hAnsi="Times New Roman" w:eastAsia="Times New Roman" w:cs="Times New Roman"/>
+    </w:rPr>
     <w:tblPr>
       <w:tblStyleRowBandSize w:val="1"/>
       <w:tblStyleColBandSize w:val="1"/>
@@ -5855,6 +6126,9 @@
     <w:pPr>
       <w:spacing w:after="0" w:line="240" w:lineRule="auto"/>
     </w:pPr>
+    <w:rPr>
+      <w:rFonts w:ascii="Times New Roman" w:hAnsi="Times New Roman" w:eastAsia="Times New Roman" w:cs="Times New Roman"/>
+    </w:rPr>
     <w:tblPr>
       <w:tblStyleRowBandSize w:val="1"/>
       <w:tblStyleColBandSize w:val="1"/>
@@ -6004,6 +6278,9 @@
     <w:pPr>
       <w:spacing w:after="0" w:line="240" w:lineRule="auto"/>
     </w:pPr>
+    <w:rPr>
+      <w:rFonts w:ascii="Times New Roman" w:hAnsi="Times New Roman" w:eastAsia="Times New Roman" w:cs="Times New Roman"/>
+    </w:rPr>
     <w:tblPr>
       <w:tblStyleRowBandSize w:val="1"/>
       <w:tblStyleColBandSize w:val="1"/>
@@ -6153,6 +6430,9 @@
     <w:pPr>
       <w:spacing w:after="0" w:line="240" w:lineRule="auto"/>
     </w:pPr>
+    <w:rPr>
+      <w:rFonts w:ascii="Times New Roman" w:hAnsi="Times New Roman" w:eastAsia="Times New Roman" w:cs="Times New Roman"/>
+    </w:rPr>
     <w:tblPr>
       <w:tblStyleRowBandSize w:val="1"/>
       <w:tblStyleColBandSize w:val="1"/>
@@ -6302,6 +6582,9 @@
     <w:pPr>
       <w:spacing w:after="0" w:line="240" w:lineRule="auto"/>
     </w:pPr>
+    <w:rPr>
+      <w:rFonts w:ascii="Times New Roman" w:hAnsi="Times New Roman" w:eastAsia="Times New Roman" w:cs="Times New Roman"/>
+    </w:rPr>
     <w:tblPr>
       <w:tblStyleRowBandSize w:val="1"/>
       <w:tblStyleColBandSize w:val="1"/>
@@ -6451,6 +6734,9 @@
     <w:pPr>
       <w:spacing w:after="0" w:line="240" w:lineRule="auto"/>
     </w:pPr>
+    <w:rPr>
+      <w:rFonts w:ascii="Times New Roman" w:hAnsi="Times New Roman" w:eastAsia="Times New Roman" w:cs="Times New Roman"/>
+    </w:rPr>
     <w:tblPr>
       <w:tblStyleRowBandSize w:val="1"/>
       <w:tblStyleColBandSize w:val="1"/>
@@ -6600,6 +6886,9 @@
     <w:pPr>
       <w:spacing w:after="0" w:line="240" w:lineRule="auto"/>
     </w:pPr>
+    <w:rPr>
+      <w:rFonts w:ascii="Times New Roman" w:hAnsi="Times New Roman" w:eastAsia="Times New Roman" w:cs="Times New Roman"/>
+    </w:rPr>
     <w:tblPr>
       <w:tblStyleRowBandSize w:val="1"/>
       <w:tblStyleColBandSize w:val="1"/>
@@ -6749,6 +7038,9 @@
     <w:pPr>
       <w:spacing w:after="0" w:line="240" w:lineRule="auto"/>
     </w:pPr>
+    <w:rPr>
+      <w:rFonts w:ascii="Times New Roman" w:hAnsi="Times New Roman" w:eastAsia="Times New Roman" w:cs="Times New Roman"/>
+    </w:rPr>
     <w:tblPr>
       <w:tblStyleRowBandSize w:val="1"/>
       <w:tblStyleColBandSize w:val="1"/>
@@ -6899,6 +7191,7 @@
       <w:spacing w:after="0" w:line="240" w:lineRule="auto"/>
     </w:pPr>
     <w:rPr>
+      <w:rFonts w:ascii="Times New Roman" w:hAnsi="Times New Roman" w:eastAsia="Times New Roman" w:cs="Times New Roman"/>
       <w:color w:val="000000" w:themeColor="text1"/>
     </w:rPr>
     <w:tblPr>
@@ -6918,7 +7211,7 @@
     </w:tblPr>
     <w:tblStylePr w:type="firstRow">
       <w:rPr>
-        <w:rFonts w:asciiTheme="majorHAnsi" w:eastAsiaTheme="majorEastAsia" w:hAnsiTheme="majorHAnsi" w:cstheme="majorBidi"/>
+        <w:rFonts w:ascii="Times New Roman" w:hAnsi="Times New Roman" w:eastAsia="Times New Roman" w:cs="Times New Roman"/>
       </w:rPr>
       <w:tblPr/>
       <w:tcPr>
@@ -6983,6 +7276,7 @@
       <w:spacing w:after="0" w:line="240" w:lineRule="auto"/>
     </w:pPr>
     <w:rPr>
+      <w:rFonts w:ascii="Times New Roman" w:hAnsi="Times New Roman" w:eastAsia="Times New Roman" w:cs="Times New Roman"/>
       <w:color w:val="000000" w:themeColor="text1"/>
     </w:rPr>
     <w:tblPr>
@@ -7002,7 +7296,7 @@
     </w:tblPr>
     <w:tblStylePr w:type="firstRow">
       <w:rPr>
-        <w:rFonts w:asciiTheme="majorHAnsi" w:eastAsiaTheme="majorEastAsia" w:hAnsiTheme="majorHAnsi" w:cstheme="majorBidi"/>
+        <w:rFonts w:ascii="Times New Roman" w:hAnsi="Times New Roman" w:eastAsia="Times New Roman" w:cs="Times New Roman"/>
       </w:rPr>
       <w:tblPr/>
       <w:tcPr>
@@ -7067,6 +7361,7 @@
       <w:spacing w:after="0" w:line="240" w:lineRule="auto"/>
     </w:pPr>
     <w:rPr>
+      <w:rFonts w:ascii="Times New Roman" w:hAnsi="Times New Roman" w:eastAsia="Times New Roman" w:cs="Times New Roman"/>
       <w:color w:val="000000" w:themeColor="text1"/>
     </w:rPr>
     <w:tblPr>
@@ -7086,7 +7381,7 @@
     </w:tblPr>
     <w:tblStylePr w:type="firstRow">
       <w:rPr>
-        <w:rFonts w:asciiTheme="majorHAnsi" w:eastAsiaTheme="majorEastAsia" w:hAnsiTheme="majorHAnsi" w:cstheme="majorBidi"/>
+        <w:rFonts w:ascii="Times New Roman" w:hAnsi="Times New Roman" w:eastAsia="Times New Roman" w:cs="Times New Roman"/>
       </w:rPr>
       <w:tblPr/>
       <w:tcPr>
@@ -7151,6 +7446,7 @@
       <w:spacing w:after="0" w:line="240" w:lineRule="auto"/>
     </w:pPr>
     <w:rPr>
+      <w:rFonts w:ascii="Times New Roman" w:hAnsi="Times New Roman" w:eastAsia="Times New Roman" w:cs="Times New Roman"/>
       <w:color w:val="000000" w:themeColor="text1"/>
     </w:rPr>
     <w:tblPr>
@@ -7170,7 +7466,7 @@
     </w:tblPr>
     <w:tblStylePr w:type="firstRow">
       <w:rPr>
-        <w:rFonts w:asciiTheme="majorHAnsi" w:eastAsiaTheme="majorEastAsia" w:hAnsiTheme="majorHAnsi" w:cstheme="majorBidi"/>
+        <w:rFonts w:ascii="Times New Roman" w:hAnsi="Times New Roman" w:eastAsia="Times New Roman" w:cs="Times New Roman"/>
       </w:rPr>
       <w:tblPr/>
       <w:tcPr>
@@ -7235,6 +7531,7 @@
       <w:spacing w:after="0" w:line="240" w:lineRule="auto"/>
     </w:pPr>
     <w:rPr>
+      <w:rFonts w:ascii="Times New Roman" w:hAnsi="Times New Roman" w:eastAsia="Times New Roman" w:cs="Times New Roman"/>
       <w:color w:val="000000" w:themeColor="text1"/>
     </w:rPr>
     <w:tblPr>
@@ -7254,7 +7551,7 @@
     </w:tblPr>
     <w:tblStylePr w:type="firstRow">
       <w:rPr>
-        <w:rFonts w:asciiTheme="majorHAnsi" w:eastAsiaTheme="majorEastAsia" w:hAnsiTheme="majorHAnsi" w:cstheme="majorBidi"/>
+        <w:rFonts w:ascii="Times New Roman" w:hAnsi="Times New Roman" w:eastAsia="Times New Roman" w:cs="Times New Roman"/>
       </w:rPr>
       <w:tblPr/>
       <w:tcPr>
@@ -7319,6 +7616,7 @@
       <w:spacing w:after="0" w:line="240" w:lineRule="auto"/>
     </w:pPr>
     <w:rPr>
+      <w:rFonts w:ascii="Times New Roman" w:hAnsi="Times New Roman" w:eastAsia="Times New Roman" w:cs="Times New Roman"/>
       <w:color w:val="000000" w:themeColor="text1"/>
     </w:rPr>
     <w:tblPr>
@@ -7338,7 +7636,7 @@
     </w:tblPr>
     <w:tblStylePr w:type="firstRow">
       <w:rPr>
-        <w:rFonts w:asciiTheme="majorHAnsi" w:eastAsiaTheme="majorEastAsia" w:hAnsiTheme="majorHAnsi" w:cstheme="majorBidi"/>
+        <w:rFonts w:ascii="Times New Roman" w:hAnsi="Times New Roman" w:eastAsia="Times New Roman" w:cs="Times New Roman"/>
       </w:rPr>
       <w:tblPr/>
       <w:tcPr>
@@ -7403,6 +7701,7 @@
       <w:spacing w:after="0" w:line="240" w:lineRule="auto"/>
     </w:pPr>
     <w:rPr>
+      <w:rFonts w:ascii="Times New Roman" w:hAnsi="Times New Roman" w:eastAsia="Times New Roman" w:cs="Times New Roman"/>
       <w:color w:val="000000" w:themeColor="text1"/>
     </w:rPr>
     <w:tblPr>
@@ -7422,7 +7721,7 @@
     </w:tblPr>
     <w:tblStylePr w:type="firstRow">
       <w:rPr>
-        <w:rFonts w:asciiTheme="majorHAnsi" w:eastAsiaTheme="majorEastAsia" w:hAnsiTheme="majorHAnsi" w:cstheme="majorBidi"/>
+        <w:rFonts w:ascii="Times New Roman" w:hAnsi="Times New Roman" w:eastAsia="Times New Roman" w:cs="Times New Roman"/>
       </w:rPr>
       <w:tblPr/>
       <w:tcPr>
@@ -7487,7 +7786,7 @@
       <w:spacing w:after="0" w:line="240" w:lineRule="auto"/>
     </w:pPr>
     <w:rPr>
-      <w:rFonts w:asciiTheme="majorHAnsi" w:eastAsiaTheme="majorEastAsia" w:hAnsiTheme="majorHAnsi" w:cstheme="majorBidi"/>
+      <w:rFonts w:ascii="Times New Roman" w:hAnsi="Times New Roman" w:eastAsia="Times New Roman" w:cs="Times New Roman"/>
       <w:color w:val="000000" w:themeColor="text1"/>
     </w:rPr>
     <w:tblPr>
@@ -7615,7 +7914,7 @@
       <w:spacing w:after="0" w:line="240" w:lineRule="auto"/>
     </w:pPr>
     <w:rPr>
-      <w:rFonts w:asciiTheme="majorHAnsi" w:eastAsiaTheme="majorEastAsia" w:hAnsiTheme="majorHAnsi" w:cstheme="majorBidi"/>
+      <w:rFonts w:ascii="Times New Roman" w:hAnsi="Times New Roman" w:eastAsia="Times New Roman" w:cs="Times New Roman"/>
       <w:color w:val="000000" w:themeColor="text1"/>
     </w:rPr>
     <w:tblPr>
@@ -7743,7 +8042,7 @@
       <w:spacing w:after="0" w:line="240" w:lineRule="auto"/>
     </w:pPr>
     <w:rPr>
-      <w:rFonts w:asciiTheme="majorHAnsi" w:eastAsiaTheme="majorEastAsia" w:hAnsiTheme="majorHAnsi" w:cstheme="majorBidi"/>
+      <w:rFonts w:ascii="Times New Roman" w:hAnsi="Times New Roman" w:eastAsia="Times New Roman" w:cs="Times New Roman"/>
       <w:color w:val="000000" w:themeColor="text1"/>
     </w:rPr>
     <w:tblPr>
@@ -7871,7 +8170,7 @@
       <w:spacing w:after="0" w:line="240" w:lineRule="auto"/>
     </w:pPr>
     <w:rPr>
-      <w:rFonts w:asciiTheme="majorHAnsi" w:eastAsiaTheme="majorEastAsia" w:hAnsiTheme="majorHAnsi" w:cstheme="majorBidi"/>
+      <w:rFonts w:ascii="Times New Roman" w:hAnsi="Times New Roman" w:eastAsia="Times New Roman" w:cs="Times New Roman"/>
       <w:color w:val="000000" w:themeColor="text1"/>
     </w:rPr>
     <w:tblPr>
@@ -7999,7 +8298,7 @@
       <w:spacing w:after="0" w:line="240" w:lineRule="auto"/>
     </w:pPr>
     <w:rPr>
-      <w:rFonts w:asciiTheme="majorHAnsi" w:eastAsiaTheme="majorEastAsia" w:hAnsiTheme="majorHAnsi" w:cstheme="majorBidi"/>
+      <w:rFonts w:ascii="Times New Roman" w:hAnsi="Times New Roman" w:eastAsia="Times New Roman" w:cs="Times New Roman"/>
       <w:color w:val="000000" w:themeColor="text1"/>
     </w:rPr>
     <w:tblPr>
@@ -8127,7 +8426,7 @@
       <w:spacing w:after="0" w:line="240" w:lineRule="auto"/>
     </w:pPr>
     <w:rPr>
-      <w:rFonts w:asciiTheme="majorHAnsi" w:eastAsiaTheme="majorEastAsia" w:hAnsiTheme="majorHAnsi" w:cstheme="majorBidi"/>
+      <w:rFonts w:ascii="Times New Roman" w:hAnsi="Times New Roman" w:eastAsia="Times New Roman" w:cs="Times New Roman"/>
       <w:color w:val="000000" w:themeColor="text1"/>
     </w:rPr>
     <w:tblPr>
@@ -8255,7 +8554,7 @@
       <w:spacing w:after="0" w:line="240" w:lineRule="auto"/>
     </w:pPr>
     <w:rPr>
-      <w:rFonts w:asciiTheme="majorHAnsi" w:eastAsiaTheme="majorEastAsia" w:hAnsiTheme="majorHAnsi" w:cstheme="majorBidi"/>
+      <w:rFonts w:ascii="Times New Roman" w:hAnsi="Times New Roman" w:eastAsia="Times New Roman" w:cs="Times New Roman"/>
       <w:color w:val="000000" w:themeColor="text1"/>
     </w:rPr>
     <w:tblPr>
@@ -8382,6 +8681,9 @@
     <w:pPr>
       <w:spacing w:after="0" w:line="240" w:lineRule="auto"/>
     </w:pPr>
+    <w:rPr>
+      <w:rFonts w:ascii="Times New Roman" w:hAnsi="Times New Roman" w:eastAsia="Times New Roman" w:cs="Times New Roman"/>
+    </w:rPr>
     <w:tblPr>
       <w:tblStyleRowBandSize w:val="1"/>
       <w:tblStyleColBandSize w:val="1"/>
@@ -8455,6 +8757,9 @@
     <w:pPr>
       <w:spacing w:after="0" w:line="240" w:lineRule="auto"/>
     </w:pPr>
+    <w:rPr>
+      <w:rFonts w:ascii="Times New Roman" w:hAnsi="Times New Roman" w:eastAsia="Times New Roman" w:cs="Times New Roman"/>
+    </w:rPr>
     <w:tblPr>
       <w:tblStyleRowBandSize w:val="1"/>
       <w:tblStyleColBandSize w:val="1"/>
@@ -8528,6 +8833,9 @@
     <w:pPr>
       <w:spacing w:after="0" w:line="240" w:lineRule="auto"/>
     </w:pPr>
+    <w:rPr>
+      <w:rFonts w:ascii="Times New Roman" w:hAnsi="Times New Roman" w:eastAsia="Times New Roman" w:cs="Times New Roman"/>
+    </w:rPr>
     <w:tblPr>
       <w:tblStyleRowBandSize w:val="1"/>
       <w:tblStyleColBandSize w:val="1"/>
@@ -8601,6 +8909,9 @@
     <w:pPr>
       <w:spacing w:after="0" w:line="240" w:lineRule="auto"/>
     </w:pPr>
+    <w:rPr>
+      <w:rFonts w:ascii="Times New Roman" w:hAnsi="Times New Roman" w:eastAsia="Times New Roman" w:cs="Times New Roman"/>
+    </w:rPr>
     <w:tblPr>
       <w:tblStyleRowBandSize w:val="1"/>
       <w:tblStyleColBandSize w:val="1"/>
@@ -8674,6 +8985,9 @@
     <w:pPr>
       <w:spacing w:after="0" w:line="240" w:lineRule="auto"/>
     </w:pPr>
+    <w:rPr>
+      <w:rFonts w:ascii="Times New Roman" w:hAnsi="Times New Roman" w:eastAsia="Times New Roman" w:cs="Times New Roman"/>
+    </w:rPr>
     <w:tblPr>
       <w:tblStyleRowBandSize w:val="1"/>
       <w:tblStyleColBandSize w:val="1"/>
@@ -8747,6 +9061,9 @@
     <w:pPr>
       <w:spacing w:after="0" w:line="240" w:lineRule="auto"/>
     </w:pPr>
+    <w:rPr>
+      <w:rFonts w:ascii="Times New Roman" w:hAnsi="Times New Roman" w:eastAsia="Times New Roman" w:cs="Times New Roman"/>
+    </w:rPr>
     <w:tblPr>
       <w:tblStyleRowBandSize w:val="1"/>
       <w:tblStyleColBandSize w:val="1"/>
@@ -8820,6 +9137,9 @@
     <w:pPr>
       <w:spacing w:after="0" w:line="240" w:lineRule="auto"/>
     </w:pPr>
+    <w:rPr>
+      <w:rFonts w:ascii="Times New Roman" w:hAnsi="Times New Roman" w:eastAsia="Times New Roman" w:cs="Times New Roman"/>
+    </w:rPr>
     <w:tblPr>
       <w:tblStyleRowBandSize w:val="1"/>
       <w:tblStyleColBandSize w:val="1"/>
@@ -8894,7 +9214,7 @@
       <w:spacing w:after="0" w:line="240" w:lineRule="auto"/>
     </w:pPr>
     <w:rPr>
-      <w:rFonts w:asciiTheme="majorHAnsi" w:eastAsiaTheme="majorEastAsia" w:hAnsiTheme="majorHAnsi" w:cstheme="majorBidi"/>
+      <w:rFonts w:ascii="Times New Roman" w:hAnsi="Times New Roman" w:eastAsia="Times New Roman" w:cs="Times New Roman"/>
       <w:color w:val="000000" w:themeColor="text1"/>
     </w:rPr>
     <w:tblPr>
@@ -9019,7 +9339,7 @@
       <w:spacing w:after="0" w:line="240" w:lineRule="auto"/>
     </w:pPr>
     <w:rPr>
-      <w:rFonts w:asciiTheme="majorHAnsi" w:eastAsiaTheme="majorEastAsia" w:hAnsiTheme="majorHAnsi" w:cstheme="majorBidi"/>
+      <w:rFonts w:ascii="Times New Roman" w:hAnsi="Times New Roman" w:eastAsia="Times New Roman" w:cs="Times New Roman"/>
       <w:color w:val="000000" w:themeColor="text1"/>
     </w:rPr>
     <w:tblPr>
@@ -9144,7 +9464,7 @@
       <w:spacing w:after="0" w:line="240" w:lineRule="auto"/>
     </w:pPr>
     <w:rPr>
-      <w:rFonts w:asciiTheme="majorHAnsi" w:eastAsiaTheme="majorEastAsia" w:hAnsiTheme="majorHAnsi" w:cstheme="majorBidi"/>
+      <w:rFonts w:ascii="Times New Roman" w:hAnsi="Times New Roman" w:eastAsia="Times New Roman" w:cs="Times New Roman"/>
       <w:color w:val="000000" w:themeColor="text1"/>
     </w:rPr>
     <w:tblPr>
@@ -9269,7 +9589,7 @@
       <w:spacing w:after="0" w:line="240" w:lineRule="auto"/>
     </w:pPr>
     <w:rPr>
-      <w:rFonts w:asciiTheme="majorHAnsi" w:eastAsiaTheme="majorEastAsia" w:hAnsiTheme="majorHAnsi" w:cstheme="majorBidi"/>
+      <w:rFonts w:ascii="Times New Roman" w:hAnsi="Times New Roman" w:eastAsia="Times New Roman" w:cs="Times New Roman"/>
       <w:color w:val="000000" w:themeColor="text1"/>
     </w:rPr>
     <w:tblPr>
@@ -9394,7 +9714,7 @@
       <w:spacing w:after="0" w:line="240" w:lineRule="auto"/>
     </w:pPr>
     <w:rPr>
-      <w:rFonts w:asciiTheme="majorHAnsi" w:eastAsiaTheme="majorEastAsia" w:hAnsiTheme="majorHAnsi" w:cstheme="majorBidi"/>
+      <w:rFonts w:ascii="Times New Roman" w:hAnsi="Times New Roman" w:eastAsia="Times New Roman" w:cs="Times New Roman"/>
       <w:color w:val="000000" w:themeColor="text1"/>
     </w:rPr>
     <w:tblPr>
@@ -9519,7 +9839,7 @@
       <w:spacing w:after="0" w:line="240" w:lineRule="auto"/>
     </w:pPr>
     <w:rPr>
-      <w:rFonts w:asciiTheme="majorHAnsi" w:eastAsiaTheme="majorEastAsia" w:hAnsiTheme="majorHAnsi" w:cstheme="majorBidi"/>
+      <w:rFonts w:ascii="Times New Roman" w:hAnsi="Times New Roman" w:eastAsia="Times New Roman" w:cs="Times New Roman"/>
       <w:color w:val="000000" w:themeColor="text1"/>
     </w:rPr>
     <w:tblPr>
@@ -9644,7 +9964,7 @@
       <w:spacing w:after="0" w:line="240" w:lineRule="auto"/>
     </w:pPr>
     <w:rPr>
-      <w:rFonts w:asciiTheme="majorHAnsi" w:eastAsiaTheme="majorEastAsia" w:hAnsiTheme="majorHAnsi" w:cstheme="majorBidi"/>
+      <w:rFonts w:ascii="Times New Roman" w:hAnsi="Times New Roman" w:eastAsia="Times New Roman" w:cs="Times New Roman"/>
       <w:color w:val="000000" w:themeColor="text1"/>
     </w:rPr>
     <w:tblPr>
@@ -9768,6 +10088,9 @@
     <w:pPr>
       <w:spacing w:after="0" w:line="240" w:lineRule="auto"/>
     </w:pPr>
+    <w:rPr>
+      <w:rFonts w:ascii="Times New Roman" w:hAnsi="Times New Roman" w:eastAsia="Times New Roman" w:cs="Times New Roman"/>
+    </w:rPr>
     <w:tblPr>
       <w:tblStyleRowBandSize w:val="1"/>
       <w:tblStyleColBandSize w:val="1"/>
@@ -9909,6 +10232,9 @@
     <w:pPr>
       <w:spacing w:after="0" w:line="240" w:lineRule="auto"/>
     </w:pPr>
+    <w:rPr>
+      <w:rFonts w:ascii="Times New Roman" w:hAnsi="Times New Roman" w:eastAsia="Times New Roman" w:cs="Times New Roman"/>
+    </w:rPr>
     <w:tblPr>
       <w:tblStyleRowBandSize w:val="1"/>
       <w:tblStyleColBandSize w:val="1"/>
@@ -10050,6 +10376,9 @@
     <w:pPr>
       <w:spacing w:after="0" w:line="240" w:lineRule="auto"/>
     </w:pPr>
+    <w:rPr>
+      <w:rFonts w:ascii="Times New Roman" w:hAnsi="Times New Roman" w:eastAsia="Times New Roman" w:cs="Times New Roman"/>
+    </w:rPr>
     <w:tblPr>
       <w:tblStyleRowBandSize w:val="1"/>
       <w:tblStyleColBandSize w:val="1"/>
@@ -10191,6 +10520,9 @@
     <w:pPr>
       <w:spacing w:after="0" w:line="240" w:lineRule="auto"/>
     </w:pPr>
+    <w:rPr>
+      <w:rFonts w:ascii="Times New Roman" w:hAnsi="Times New Roman" w:eastAsia="Times New Roman" w:cs="Times New Roman"/>
+    </w:rPr>
     <w:tblPr>
       <w:tblStyleRowBandSize w:val="1"/>
       <w:tblStyleColBandSize w:val="1"/>
@@ -10332,6 +10664,9 @@
     <w:pPr>
       <w:spacing w:after="0" w:line="240" w:lineRule="auto"/>
     </w:pPr>
+    <w:rPr>
+      <w:rFonts w:ascii="Times New Roman" w:hAnsi="Times New Roman" w:eastAsia="Times New Roman" w:cs="Times New Roman"/>
+    </w:rPr>
     <w:tblPr>
       <w:tblStyleRowBandSize w:val="1"/>
       <w:tblStyleColBandSize w:val="1"/>
@@ -10473,6 +10808,9 @@
     <w:pPr>
       <w:spacing w:after="0" w:line="240" w:lineRule="auto"/>
     </w:pPr>
+    <w:rPr>
+      <w:rFonts w:ascii="Times New Roman" w:hAnsi="Times New Roman" w:eastAsia="Times New Roman" w:cs="Times New Roman"/>
+    </w:rPr>
     <w:tblPr>
       <w:tblStyleRowBandSize w:val="1"/>
       <w:tblStyleColBandSize w:val="1"/>
@@ -10614,6 +10952,9 @@
     <w:pPr>
       <w:spacing w:after="0" w:line="240" w:lineRule="auto"/>
     </w:pPr>
+    <w:rPr>
+      <w:rFonts w:ascii="Times New Roman" w:hAnsi="Times New Roman" w:eastAsia="Times New Roman" w:cs="Times New Roman"/>
+    </w:rPr>
     <w:tblPr>
       <w:tblStyleRowBandSize w:val="1"/>
       <w:tblStyleColBandSize w:val="1"/>
@@ -10756,6 +11097,7 @@
       <w:spacing w:after="0" w:line="240" w:lineRule="auto"/>
     </w:pPr>
     <w:rPr>
+      <w:rFonts w:ascii="Times New Roman" w:hAnsi="Times New Roman" w:eastAsia="Times New Roman" w:cs="Times New Roman"/>
       <w:color w:val="FFFFFF" w:themeColor="background1"/>
     </w:rPr>
     <w:tblPr>
@@ -10870,6 +11212,7 @@
       <w:spacing w:after="0" w:line="240" w:lineRule="auto"/>
     </w:pPr>
     <w:rPr>
+      <w:rFonts w:ascii="Times New Roman" w:hAnsi="Times New Roman" w:eastAsia="Times New Roman" w:cs="Times New Roman"/>
       <w:color w:val="FFFFFF" w:themeColor="background1"/>
     </w:rPr>
     <w:tblPr>
@@ -10984,6 +11327,7 @@
       <w:spacing w:after="0" w:line="240" w:lineRule="auto"/>
     </w:pPr>
     <w:rPr>
+      <w:rFonts w:ascii="Times New Roman" w:hAnsi="Times New Roman" w:eastAsia="Times New Roman" w:cs="Times New Roman"/>
       <w:color w:val="FFFFFF" w:themeColor="background1"/>
     </w:rPr>
     <w:tblPr>
@@ -11098,6 +11442,7 @@
       <w:spacing w:after="0" w:line="240" w:lineRule="auto"/>
     </w:pPr>
     <w:rPr>
+      <w:rFonts w:ascii="Times New Roman" w:hAnsi="Times New Roman" w:eastAsia="Times New Roman" w:cs="Times New Roman"/>
       <w:color w:val="FFFFFF" w:themeColor="background1"/>
     </w:rPr>
     <w:tblPr>
@@ -11212,6 +11557,7 @@
       <w:spacing w:after="0" w:line="240" w:lineRule="auto"/>
     </w:pPr>
     <w:rPr>
+      <w:rFonts w:ascii="Times New Roman" w:hAnsi="Times New Roman" w:eastAsia="Times New Roman" w:cs="Times New Roman"/>
       <w:color w:val="FFFFFF" w:themeColor="background1"/>
     </w:rPr>
     <w:tblPr>
@@ -11326,6 +11672,7 @@
       <w:spacing w:after="0" w:line="240" w:lineRule="auto"/>
     </w:pPr>
     <w:rPr>
+      <w:rFonts w:ascii="Times New Roman" w:hAnsi="Times New Roman" w:eastAsia="Times New Roman" w:cs="Times New Roman"/>
       <w:color w:val="FFFFFF" w:themeColor="background1"/>
     </w:rPr>
     <w:tblPr>
@@ -11440,6 +11787,7 @@
       <w:spacing w:after="0" w:line="240" w:lineRule="auto"/>
     </w:pPr>
     <w:rPr>
+      <w:rFonts w:ascii="Times New Roman" w:hAnsi="Times New Roman" w:eastAsia="Times New Roman" w:cs="Times New Roman"/>
       <w:color w:val="FFFFFF" w:themeColor="background1"/>
     </w:rPr>
     <w:tblPr>
@@ -11554,6 +11902,7 @@
       <w:spacing w:after="0" w:line="240" w:lineRule="auto"/>
     </w:pPr>
     <w:rPr>
+      <w:rFonts w:ascii="Times New Roman" w:hAnsi="Times New Roman" w:eastAsia="Times New Roman" w:cs="Times New Roman"/>
       <w:color w:val="000000" w:themeColor="text1"/>
     </w:rPr>
     <w:tblPr>
@@ -11676,6 +12025,7 @@
       <w:spacing w:after="0" w:line="240" w:lineRule="auto"/>
     </w:pPr>
     <w:rPr>
+      <w:rFonts w:ascii="Times New Roman" w:hAnsi="Times New Roman" w:eastAsia="Times New Roman" w:cs="Times New Roman"/>
       <w:color w:val="000000" w:themeColor="text1"/>
     </w:rPr>
     <w:tblPr>
@@ -11798,6 +12148,7 @@
       <w:spacing w:after="0" w:line="240" w:lineRule="auto"/>
     </w:pPr>
     <w:rPr>
+      <w:rFonts w:ascii="Times New Roman" w:hAnsi="Times New Roman" w:eastAsia="Times New Roman" w:cs="Times New Roman"/>
       <w:color w:val="000000" w:themeColor="text1"/>
     </w:rPr>
     <w:tblPr>
@@ -11920,6 +12271,7 @@
       <w:spacing w:after="0" w:line="240" w:lineRule="auto"/>
     </w:pPr>
     <w:rPr>
+      <w:rFonts w:ascii="Times New Roman" w:hAnsi="Times New Roman" w:eastAsia="Times New Roman" w:cs="Times New Roman"/>
       <w:color w:val="000000" w:themeColor="text1"/>
     </w:rPr>
     <w:tblPr>
@@ -12032,6 +12384,7 @@
       <w:spacing w:after="0" w:line="240" w:lineRule="auto"/>
     </w:pPr>
     <w:rPr>
+      <w:rFonts w:ascii="Times New Roman" w:hAnsi="Times New Roman" w:eastAsia="Times New Roman" w:cs="Times New Roman"/>
       <w:color w:val="000000" w:themeColor="text1"/>
     </w:rPr>
     <w:tblPr>
@@ -12154,6 +12507,7 @@
       <w:spacing w:after="0" w:line="240" w:lineRule="auto"/>
     </w:pPr>
     <w:rPr>
+      <w:rFonts w:ascii="Times New Roman" w:hAnsi="Times New Roman" w:eastAsia="Times New Roman" w:cs="Times New Roman"/>
       <w:color w:val="000000" w:themeColor="text1"/>
     </w:rPr>
     <w:tblPr>
@@ -12276,6 +12630,7 @@
       <w:spacing w:after="0" w:line="240" w:lineRule="auto"/>
     </w:pPr>
     <w:rPr>
+      <w:rFonts w:ascii="Times New Roman" w:hAnsi="Times New Roman" w:eastAsia="Times New Roman" w:cs="Times New Roman"/>
       <w:color w:val="000000" w:themeColor="text1"/>
     </w:rPr>
     <w:tblPr>
@@ -12398,6 +12753,7 @@
       <w:spacing w:after="0" w:line="240" w:lineRule="auto"/>
     </w:pPr>
     <w:rPr>
+      <w:rFonts w:ascii="Times New Roman" w:hAnsi="Times New Roman" w:eastAsia="Times New Roman" w:cs="Times New Roman"/>
       <w:color w:val="000000" w:themeColor="text1"/>
     </w:rPr>
     <w:tblPr>
@@ -12484,6 +12840,7 @@
       <w:spacing w:after="0" w:line="240" w:lineRule="auto"/>
     </w:pPr>
     <w:rPr>
+      <w:rFonts w:ascii="Times New Roman" w:hAnsi="Times New Roman" w:eastAsia="Times New Roman" w:cs="Times New Roman"/>
       <w:color w:val="000000" w:themeColor="text1"/>
     </w:rPr>
     <w:tblPr>
@@ -12570,6 +12927,7 @@
       <w:spacing w:after="0" w:line="240" w:lineRule="auto"/>
     </w:pPr>
     <w:rPr>
+      <w:rFonts w:ascii="Times New Roman" w:hAnsi="Times New Roman" w:eastAsia="Times New Roman" w:cs="Times New Roman"/>
       <w:color w:val="000000" w:themeColor="text1"/>
     </w:rPr>
     <w:tblPr>
@@ -12656,6 +13014,7 @@
       <w:spacing w:after="0" w:line="240" w:lineRule="auto"/>
     </w:pPr>
     <w:rPr>
+      <w:rFonts w:ascii="Times New Roman" w:hAnsi="Times New Roman" w:eastAsia="Times New Roman" w:cs="Times New Roman"/>
       <w:color w:val="000000" w:themeColor="text1"/>
     </w:rPr>
     <w:tblPr>
@@ -12742,6 +13101,7 @@
       <w:spacing w:after="0" w:line="240" w:lineRule="auto"/>
     </w:pPr>
     <w:rPr>
+      <w:rFonts w:ascii="Times New Roman" w:hAnsi="Times New Roman" w:eastAsia="Times New Roman" w:cs="Times New Roman"/>
       <w:color w:val="000000" w:themeColor="text1"/>
     </w:rPr>
     <w:tblPr>
@@ -12828,6 +13188,7 @@
       <w:spacing w:after="0" w:line="240" w:lineRule="auto"/>
     </w:pPr>
     <w:rPr>
+      <w:rFonts w:ascii="Times New Roman" w:hAnsi="Times New Roman" w:eastAsia="Times New Roman" w:cs="Times New Roman"/>
       <w:color w:val="000000" w:themeColor="text1"/>
     </w:rPr>
     <w:tblPr>
@@ -12914,6 +13275,7 @@
       <w:spacing w:after="0" w:line="240" w:lineRule="auto"/>
     </w:pPr>
     <w:rPr>
+      <w:rFonts w:ascii="Times New Roman" w:hAnsi="Times New Roman" w:eastAsia="Times New Roman" w:cs="Times New Roman"/>
       <w:color w:val="000000" w:themeColor="text1"/>
     </w:rPr>
     <w:tblPr>
@@ -13000,6 +13362,7 @@
       <w:spacing w:after="0" w:line="240" w:lineRule="auto"/>
     </w:pPr>
     <w:rPr>
+      <w:rFonts w:ascii="Times New Roman" w:hAnsi="Times New Roman" w:eastAsia="Times New Roman" w:cs="Times New Roman"/>
       <w:color w:val="000000" w:themeColor="text1"/>
     </w:rPr>
     <w:tblPr>
@@ -13080,6 +13443,7 @@
       <w:spacing w:after="0" w:line="240" w:lineRule="auto"/>
     </w:pPr>
     <w:rPr>
+      <w:rFonts w:ascii="Times New Roman" w:hAnsi="Times New Roman" w:eastAsia="Times New Roman" w:cs="Times New Roman"/>
       <w:color w:val="000000" w:themeColor="text1"/>
     </w:rPr>
     <w:tblPr>
@@ -13160,6 +13524,7 @@
       <w:spacing w:after="0" w:line="240" w:lineRule="auto"/>
     </w:pPr>
     <w:rPr>
+      <w:rFonts w:ascii="Times New Roman" w:hAnsi="Times New Roman" w:eastAsia="Times New Roman" w:cs="Times New Roman"/>
       <w:color w:val="000000" w:themeColor="text1"/>
     </w:rPr>
     <w:tblPr>
@@ -13240,6 +13605,7 @@
       <w:spacing w:after="0" w:line="240" w:lineRule="auto"/>
     </w:pPr>
     <w:rPr>
+      <w:rFonts w:ascii="Times New Roman" w:hAnsi="Times New Roman" w:eastAsia="Times New Roman" w:cs="Times New Roman"/>
       <w:color w:val="000000" w:themeColor="text1"/>
     </w:rPr>
     <w:tblPr>
@@ -13320,6 +13686,7 @@
       <w:spacing w:after="0" w:line="240" w:lineRule="auto"/>
     </w:pPr>
     <w:rPr>
+      <w:rFonts w:ascii="Times New Roman" w:hAnsi="Times New Roman" w:eastAsia="Times New Roman" w:cs="Times New Roman"/>
       <w:color w:val="000000" w:themeColor="text1"/>
     </w:rPr>
     <w:tblPr>
@@ -13400,6 +13767,7 @@
       <w:spacing w:after="0" w:line="240" w:lineRule="auto"/>
     </w:pPr>
     <w:rPr>
+      <w:rFonts w:ascii="Times New Roman" w:hAnsi="Times New Roman" w:eastAsia="Times New Roman" w:cs="Times New Roman"/>
       <w:color w:val="000000" w:themeColor="text1"/>
     </w:rPr>
     <w:tblPr>
@@ -13480,6 +13848,7 @@
       <w:spacing w:after="0" w:line="240" w:lineRule="auto"/>
     </w:pPr>
     <w:rPr>
+      <w:rFonts w:ascii="Times New Roman" w:hAnsi="Times New Roman" w:eastAsia="Times New Roman" w:cs="Times New Roman"/>
       <w:color w:val="000000" w:themeColor="text1"/>
     </w:rPr>
     <w:tblPr>

</xml_diff>